<commit_message>
added my parts of the report
</commit_message>
<xml_diff>
--- a/Project Report.docx
+++ b/Project Report.docx
@@ -1,6 +1,6 @@
 
 <file path=word/document.xml><?xml version="1.0" encoding="utf-8"?>
-<w:document xmlns:wpc="http://schemas.microsoft.com/office/word/2010/wordprocessingCanvas" xmlns:cx="http://schemas.microsoft.com/office/drawing/2014/chartex" xmlns:cx1="http://schemas.microsoft.com/office/drawing/2015/9/8/chartex" xmlns:cx2="http://schemas.microsoft.com/office/drawing/2015/10/21/chartex" xmlns:cx3="http://schemas.microsoft.com/office/drawing/2016/5/9/chartex" xmlns:cx4="http://schemas.microsoft.com/office/drawing/2016/5/10/chartex" xmlns:cx5="http://schemas.microsoft.com/office/drawing/2016/5/11/chartex" xmlns:cx6="http://schemas.microsoft.com/office/drawing/2016/5/12/chartex" xmlns:cx7="http://schemas.microsoft.com/office/drawing/2016/5/13/chartex" xmlns:cx8="http://schemas.microsoft.com/office/drawing/2016/5/14/chartex" xmlns:mc="http://schemas.openxmlformats.org/markup-compatibility/2006" xmlns:aink="http://schemas.microsoft.com/office/drawing/2016/ink" xmlns:am3d="http://schemas.microsoft.com/office/drawing/2017/model3d" xmlns:o="urn:schemas-microsoft-com:office:office" xmlns:r="http://schemas.openxmlformats.org/officeDocument/2006/relationships" xmlns:m="http://schemas.openxmlformats.org/officeDocument/2006/math" xmlns:v="urn:schemas-microsoft-com:vml" xmlns:wp14="http://schemas.microsoft.com/office/word/2010/wordprocessingDrawing" xmlns:wp="http://schemas.openxmlformats.org/drawingml/2006/wordprocessingDrawing" xmlns:w10="urn:schemas-microsoft-com:office:word" xmlns:w="http://schemas.openxmlformats.org/wordprocessingml/2006/main" xmlns:w14="http://schemas.microsoft.com/office/word/2010/wordml" xmlns:w15="http://schemas.microsoft.com/office/word/2012/wordml" xmlns:w16cex="http://schemas.microsoft.com/office/word/2018/wordml/cex" xmlns:w16cid="http://schemas.microsoft.com/office/word/2016/wordml/cid" xmlns:w16="http://schemas.microsoft.com/office/word/2018/wordml" xmlns:w16sdtdh="http://schemas.microsoft.com/office/word/2020/wordml/sdtdatahash" xmlns:w16se="http://schemas.microsoft.com/office/word/2015/wordml/symex" xmlns:wpg="http://schemas.microsoft.com/office/word/2010/wordprocessingGroup" xmlns:wpi="http://schemas.microsoft.com/office/word/2010/wordprocessingInk" xmlns:wne="http://schemas.microsoft.com/office/word/2006/wordml" xmlns:wps="http://schemas.microsoft.com/office/word/2010/wordprocessingShape" mc:Ignorable="w14 w15 w16se w16cid w16 w16cex w16sdtdh wp14">
+<w:document xmlns:wpc="http://schemas.microsoft.com/office/word/2010/wordprocessingCanvas" xmlns:cx="http://schemas.microsoft.com/office/drawing/2014/chartex" xmlns:mc="http://schemas.openxmlformats.org/markup-compatibility/2006" xmlns:o="urn:schemas-microsoft-com:office:office" xmlns:r="http://schemas.openxmlformats.org/officeDocument/2006/relationships" xmlns:m="http://schemas.openxmlformats.org/officeDocument/2006/math" xmlns:v="urn:schemas-microsoft-com:vml" xmlns:wp14="http://schemas.microsoft.com/office/word/2010/wordprocessingDrawing" xmlns:wp="http://schemas.openxmlformats.org/drawingml/2006/wordprocessingDrawing" xmlns:w10="urn:schemas-microsoft-com:office:word" xmlns:w="http://schemas.openxmlformats.org/wordprocessingml/2006/main" xmlns:w14="http://schemas.microsoft.com/office/word/2010/wordml" xmlns:w15="http://schemas.microsoft.com/office/word/2012/wordml" xmlns:w16se="http://schemas.microsoft.com/office/word/2015/wordml/symex" xmlns:wpg="http://schemas.microsoft.com/office/word/2010/wordprocessingGroup" xmlns:wpi="http://schemas.microsoft.com/office/word/2010/wordprocessingInk" xmlns:wne="http://schemas.microsoft.com/office/word/2006/wordml" xmlns:wps="http://schemas.microsoft.com/office/word/2010/wordprocessingShape" mc:Ignorable="w14 w15 w16se wp14">
   <w:body>
     <w:p>
       <w:pPr>
@@ -128,6 +128,16 @@
           <w:rFonts w:ascii="Cambria" w:hAnsi="Cambria"/>
         </w:rPr>
       </w:pPr>
+    </w:p>
+    <w:p>
+      <w:pPr>
+        <w:pStyle w:val="BodyText"/>
+        <w:ind w:left="360"/>
+        <w:jc w:val="both"/>
+        <w:rPr>
+          <w:rFonts w:ascii="Cambria" w:hAnsi="Cambria"/>
+        </w:rPr>
+      </w:pPr>
       <w:r>
         <w:rPr>
           <w:rFonts w:ascii="Cambria" w:hAnsi="Cambria"/>
@@ -394,6 +404,12 @@
     </w:p>
     <w:p>
       <w:pPr>
+        <w:pStyle w:val="BodyText"/>
+        <w:jc w:val="both"/>
+      </w:pPr>
+    </w:p>
+    <w:p>
+      <w:pPr>
         <w:pStyle w:val="Title"/>
         <w:numPr>
           <w:ilvl w:val="0"/>
@@ -433,14 +449,13 @@
           <w:b/>
           <w:bCs/>
         </w:rPr>
-        <w:lastRenderedPageBreak/>
         <w:t>Just speaking about what we were able to achieve isn’t enough, so we have to dive into each particular set and explain the mechanics and how they were made possible:</w:t>
       </w:r>
     </w:p>
     <w:p>
       <w:pPr>
         <w:pStyle w:val="BodyText"/>
-        <w:ind w:left="360"/>
+        <w:ind w:firstLine="360"/>
         <w:jc w:val="both"/>
         <w:rPr>
           <w:rFonts w:ascii="Cambria" w:eastAsia="Calibri" w:hAnsi="Cambria"/>
@@ -460,25 +475,50 @@
           <w:szCs w:val="28"/>
           <w:u w:val="single"/>
         </w:rPr>
-        <w:t>The Sun and Planets ( SPHERES ):</w:t>
-      </w:r>
-    </w:p>
-    <w:p>
-      <w:pPr>
-        <w:pStyle w:val="BodyText"/>
-        <w:ind w:left="360"/>
-        <w:jc w:val="both"/>
-        <w:rPr>
-          <w:rFonts w:ascii="Cambria" w:eastAsia="Calibri" w:hAnsi="Cambria"/>
-          <w:b/>
-          <w:bCs/>
-        </w:rPr>
-      </w:pPr>
-      <w:r>
-        <w:rPr>
-          <w:rFonts w:ascii="Cambria" w:eastAsia="Calibri" w:hAnsi="Cambria"/>
-          <w:b/>
-          <w:bCs/>
+        <w:t xml:space="preserve">The Sun and Planets </w:t>
+      </w:r>
+      <w:proofErr w:type="gramStart"/>
+      <w:r>
+        <w:rPr>
+          <w:rFonts w:ascii="Cambria" w:eastAsia="Calibri" w:hAnsi="Cambria"/>
+          <w:b/>
+          <w:bCs/>
+          <w:sz w:val="28"/>
+          <w:szCs w:val="28"/>
+          <w:u w:val="single"/>
+        </w:rPr>
+        <w:t>( SPHERES</w:t>
+      </w:r>
+      <w:proofErr w:type="gramEnd"/>
+      <w:r>
+        <w:rPr>
+          <w:rFonts w:ascii="Cambria" w:eastAsia="Calibri" w:hAnsi="Cambria"/>
+          <w:b/>
+          <w:bCs/>
+          <w:sz w:val="28"/>
+          <w:szCs w:val="28"/>
+          <w:u w:val="single"/>
+        </w:rPr>
+        <w:t xml:space="preserve"> ):</w:t>
+      </w:r>
+    </w:p>
+    <w:p>
+      <w:pPr>
+        <w:pStyle w:val="BodyText"/>
+        <w:ind w:left="360"/>
+        <w:jc w:val="both"/>
+        <w:rPr>
+          <w:rFonts w:ascii="Cambria" w:eastAsia="Calibri" w:hAnsi="Cambria"/>
+          <w:b/>
+          <w:bCs/>
+        </w:rPr>
+      </w:pPr>
+      <w:r>
+        <w:rPr>
+          <w:rFonts w:ascii="Cambria" w:eastAsia="Calibri" w:hAnsi="Cambria"/>
+          <w:b/>
+          <w:bCs/>
+          <w:noProof/>
         </w:rPr>
         <w:drawing>
           <wp:inline distT="0" distB="0" distL="0" distR="0" wp14:anchorId="573BDE4C" wp14:editId="0EECB658">
@@ -548,28 +588,42 @@
           <w:i/>
           <w:iCs/>
         </w:rPr>
-        <w:t>a: Snippet Of Code From The Planet Class</w:t>
-      </w:r>
-    </w:p>
-    <w:p>
-      <w:pPr>
-        <w:pStyle w:val="BodyText"/>
-        <w:ind w:left="360"/>
-        <w:jc w:val="both"/>
-        <w:rPr>
-          <w:rFonts w:ascii="Cambria" w:eastAsia="Calibri" w:hAnsi="Cambria"/>
-          <w:b/>
-          <w:bCs/>
-        </w:rPr>
-      </w:pPr>
-      <w:r>
-        <w:rPr>
-          <w:rFonts w:ascii="Cambria" w:eastAsia="Calibri" w:hAnsi="Cambria"/>
-          <w:b/>
-          <w:bCs/>
-        </w:rPr>
-        <w:t xml:space="preserve">When creating a planet via the Planet Class, we give it’s radius to determine how big the sphere actually is, sections to determine realism, axis speed which determines how fast the planet spins, orbit speed which determines how fast the planet orbits the sun, and the distance between the planet and the sun, using a </w:t>
-      </w:r>
+        <w:t xml:space="preserve">a: Snippet </w:t>
+      </w:r>
+      <w:proofErr w:type="gramStart"/>
+      <w:r>
+        <w:rPr>
+          <w:rFonts w:ascii="Cambria" w:eastAsia="Calibri" w:hAnsi="Cambria"/>
+          <w:b/>
+          <w:bCs/>
+          <w:i/>
+          <w:iCs/>
+        </w:rPr>
+        <w:t>Of</w:t>
+      </w:r>
+      <w:proofErr w:type="gramEnd"/>
+      <w:r>
+        <w:rPr>
+          <w:rFonts w:ascii="Cambria" w:eastAsia="Calibri" w:hAnsi="Cambria"/>
+          <w:b/>
+          <w:bCs/>
+          <w:i/>
+          <w:iCs/>
+        </w:rPr>
+        <w:t xml:space="preserve"> Code From The Planet Class</w:t>
+      </w:r>
+    </w:p>
+    <w:p>
+      <w:pPr>
+        <w:pStyle w:val="BodyText"/>
+        <w:ind w:left="360"/>
+        <w:jc w:val="both"/>
+        <w:rPr>
+          <w:rFonts w:ascii="Cambria" w:eastAsia="Calibri" w:hAnsi="Cambria"/>
+          <w:b/>
+          <w:bCs/>
+        </w:rPr>
+      </w:pPr>
       <w:r>
         <w:rPr>
           <w:rFonts w:ascii="Cambria" w:eastAsia="Calibri" w:hAnsi="Cambria"/>
@@ -577,7 +631,7 @@
           <w:bCs/>
         </w:rPr>
         <w:lastRenderedPageBreak/>
-        <w:t>continuous update() function whilst the program is running, we add the axis speed to the axis angle, and orbit speed to the orbit angle, which determines the rotation and the planet’s position in orbit around the sun respectively.</w:t>
+        <w:t>When creating a planet via the Planet Class, we give it’s radius to determine how big the sphere actually is, sections to determine realism, axis speed which determines how fast the planet spins, orbit speed which determines how fast the planet orbits the sun, and the distance between the planet and the sun, using a continuous update() function whilst the program is running, we add the axis speed to the axis angle, and orbit speed to the orbit angle, which determines the rotation and the planet’s position in orbit around the sun respectively.</w:t>
       </w:r>
     </w:p>
     <w:p>
@@ -603,25 +657,50 @@
           <w:szCs w:val="28"/>
           <w:u w:val="single"/>
         </w:rPr>
-        <w:t>Gradient Colors For Planets:</w:t>
-      </w:r>
-    </w:p>
-    <w:p>
-      <w:pPr>
-        <w:pStyle w:val="BodyText"/>
-        <w:ind w:left="360"/>
-        <w:jc w:val="both"/>
-        <w:rPr>
-          <w:rFonts w:ascii="Cambria" w:eastAsia="Calibri" w:hAnsi="Cambria"/>
-          <w:b/>
-          <w:bCs/>
-        </w:rPr>
-      </w:pPr>
-      <w:r>
-        <w:rPr>
-          <w:rFonts w:ascii="Cambria" w:eastAsia="Calibri" w:hAnsi="Cambria"/>
-          <w:b/>
-          <w:bCs/>
+        <w:t xml:space="preserve">Gradient Colors </w:t>
+      </w:r>
+      <w:proofErr w:type="gramStart"/>
+      <w:r>
+        <w:rPr>
+          <w:rFonts w:ascii="Cambria" w:eastAsia="Calibri" w:hAnsi="Cambria"/>
+          <w:b/>
+          <w:bCs/>
+          <w:sz w:val="28"/>
+          <w:szCs w:val="28"/>
+          <w:u w:val="single"/>
+        </w:rPr>
+        <w:t>For</w:t>
+      </w:r>
+      <w:proofErr w:type="gramEnd"/>
+      <w:r>
+        <w:rPr>
+          <w:rFonts w:ascii="Cambria" w:eastAsia="Calibri" w:hAnsi="Cambria"/>
+          <w:b/>
+          <w:bCs/>
+          <w:sz w:val="28"/>
+          <w:szCs w:val="28"/>
+          <w:u w:val="single"/>
+        </w:rPr>
+        <w:t xml:space="preserve"> Planets:</w:t>
+      </w:r>
+    </w:p>
+    <w:p>
+      <w:pPr>
+        <w:pStyle w:val="BodyText"/>
+        <w:ind w:left="360"/>
+        <w:jc w:val="both"/>
+        <w:rPr>
+          <w:rFonts w:ascii="Cambria" w:eastAsia="Calibri" w:hAnsi="Cambria"/>
+          <w:b/>
+          <w:bCs/>
+        </w:rPr>
+      </w:pPr>
+      <w:r>
+        <w:rPr>
+          <w:rFonts w:ascii="Cambria" w:eastAsia="Calibri" w:hAnsi="Cambria"/>
+          <w:b/>
+          <w:bCs/>
+          <w:noProof/>
         </w:rPr>
         <w:drawing>
           <wp:inline distT="0" distB="0" distL="0" distR="0" wp14:anchorId="32FD732C" wp14:editId="40383E38">
@@ -681,27 +760,67 @@
           <w:i/>
           <w:iCs/>
         </w:rPr>
-        <w:t>2a: The code used in the Planet class’s draw() function, gradient coloring part.</w:t>
-      </w:r>
-    </w:p>
-    <w:p>
-      <w:pPr>
-        <w:pStyle w:val="BodyText"/>
-        <w:ind w:left="360"/>
-        <w:jc w:val="both"/>
-        <w:rPr>
-          <w:rFonts w:ascii="Cambria" w:eastAsia="Calibri" w:hAnsi="Cambria"/>
-          <w:b/>
-          <w:bCs/>
-        </w:rPr>
-      </w:pPr>
-      <w:r>
-        <w:rPr>
-          <w:rFonts w:ascii="Cambria" w:eastAsia="Calibri" w:hAnsi="Cambria"/>
-          <w:b/>
-          <w:bCs/>
-        </w:rPr>
-        <w:t>While drawing the sphere, the program checks the Y position of each vertex to know how high or low that point is on the planet. It then converts that height into a value called t, where 0 means the bottom of the planet, 1 means the top, and values in between represent points between them. This value is used to blend between the bottom and top colors using linear interpolation. Before each vertex is drawn, glColor3f() sets the calculated color for that vertex. OpenGL smoothly blends the colors between nearby vertices, creating a vertical gradient.</w:t>
+        <w:t xml:space="preserve">2a: The code used in the Planet class’s </w:t>
+      </w:r>
+      <w:proofErr w:type="gramStart"/>
+      <w:r>
+        <w:rPr>
+          <w:rFonts w:ascii="Cambria" w:eastAsia="Calibri" w:hAnsi="Cambria"/>
+          <w:b/>
+          <w:bCs/>
+          <w:i/>
+          <w:iCs/>
+        </w:rPr>
+        <w:t>draw(</w:t>
+      </w:r>
+      <w:proofErr w:type="gramEnd"/>
+      <w:r>
+        <w:rPr>
+          <w:rFonts w:ascii="Cambria" w:eastAsia="Calibri" w:hAnsi="Cambria"/>
+          <w:b/>
+          <w:bCs/>
+          <w:i/>
+          <w:iCs/>
+        </w:rPr>
+        <w:t>) function, gradient coloring part.</w:t>
+      </w:r>
+    </w:p>
+    <w:p>
+      <w:pPr>
+        <w:pStyle w:val="BodyText"/>
+        <w:ind w:left="360"/>
+        <w:jc w:val="both"/>
+        <w:rPr>
+          <w:rFonts w:ascii="Cambria" w:eastAsia="Calibri" w:hAnsi="Cambria"/>
+          <w:b/>
+          <w:bCs/>
+        </w:rPr>
+      </w:pPr>
+      <w:r>
+        <w:rPr>
+          <w:rFonts w:ascii="Cambria" w:eastAsia="Calibri" w:hAnsi="Cambria"/>
+          <w:b/>
+          <w:bCs/>
+        </w:rPr>
+        <w:t>While drawing the sphere, the program checks the Y position of each vertex to know how high or low that point is on the planet. It then converts that height into a value called t, where 0 means the bottom of the planet, 1 means the top, and values in between represent points between them. This value is used to blend between the bottom and top colors using linear interpolation. Before each vertex is drawn, glColor3</w:t>
+      </w:r>
+      <w:proofErr w:type="gramStart"/>
+      <w:r>
+        <w:rPr>
+          <w:rFonts w:ascii="Cambria" w:eastAsia="Calibri" w:hAnsi="Cambria"/>
+          <w:b/>
+          <w:bCs/>
+        </w:rPr>
+        <w:t>f(</w:t>
+      </w:r>
+      <w:proofErr w:type="gramEnd"/>
+      <w:r>
+        <w:rPr>
+          <w:rFonts w:ascii="Cambria" w:eastAsia="Calibri" w:hAnsi="Cambria"/>
+          <w:b/>
+          <w:bCs/>
+        </w:rPr>
+        <w:t>) sets the calculated color for that vertex. OpenGL smoothly blends the colors between nearby vertices, creating a vertical gradient.</w:t>
       </w:r>
       <w:r>
         <w:rPr>
@@ -726,7 +845,12 @@
           <w:u w:val="single"/>
         </w:rPr>
       </w:pPr>
-      <w:r>
+    </w:p>
+    <w:p>
+      <w:pPr>
+        <w:pStyle w:val="BodyText"/>
+        <w:ind w:left="360"/>
+        <w:jc w:val="both"/>
         <w:rPr>
           <w:rFonts w:ascii="Cambria" w:eastAsia="Calibri" w:hAnsi="Cambria"/>
           <w:b/>
@@ -735,6 +859,17 @@
           <w:szCs w:val="28"/>
           <w:u w:val="single"/>
         </w:rPr>
+      </w:pPr>
+      <w:r>
+        <w:rPr>
+          <w:rFonts w:ascii="Cambria" w:eastAsia="Calibri" w:hAnsi="Cambria"/>
+          <w:b/>
+          <w:bCs/>
+          <w:sz w:val="28"/>
+          <w:szCs w:val="28"/>
+          <w:u w:val="single"/>
+        </w:rPr>
+        <w:lastRenderedPageBreak/>
         <w:t>Orbit Trails:</w:t>
       </w:r>
     </w:p>
@@ -754,12 +889,12 @@
           <w:rFonts w:ascii="Cambria" w:eastAsia="Calibri" w:hAnsi="Cambria"/>
           <w:b/>
           <w:bCs/>
-        </w:rPr>
-        <w:lastRenderedPageBreak/>
+          <w:noProof/>
+        </w:rPr>
         <w:drawing>
-          <wp:inline distT="0" distB="0" distL="0" distR="0" wp14:anchorId="4B5746FC" wp14:editId="63014FD0">
-            <wp:extent cx="5876925" cy="4645660"/>
-            <wp:effectExtent l="0" t="0" r="9525" b="2540"/>
+          <wp:inline distT="0" distB="0" distL="0" distR="0" wp14:anchorId="4B5746FC" wp14:editId="523AE5D2">
+            <wp:extent cx="6015092" cy="4754880"/>
+            <wp:effectExtent l="0" t="0" r="5080" b="7620"/>
             <wp:docPr id="10" name="Picture 10" descr="A computer screen with text and images&#10;&#10;AI-generated content may be incorrect."/>
             <wp:cNvGraphicFramePr>
               <a:graphicFrameLocks xmlns:a="http://schemas.openxmlformats.org/drawingml/2006/main" noChangeAspect="1"/>
@@ -780,7 +915,7 @@
                   <pic:spPr>
                     <a:xfrm>
                       <a:off x="0" y="0"/>
-                      <a:ext cx="5876925" cy="4645660"/>
+                      <a:ext cx="6034676" cy="4770361"/>
                     </a:xfrm>
                     <a:prstGeom prst="rect">
                       <a:avLst/>
@@ -906,6 +1041,7 @@
           <w:szCs w:val="28"/>
           <w:u w:val="single"/>
         </w:rPr>
+        <w:lastRenderedPageBreak/>
         <w:t>Moons:</w:t>
       </w:r>
     </w:p>
@@ -927,14 +1063,14 @@
           <w:rFonts w:ascii="Cambria" w:eastAsia="Calibri" w:hAnsi="Cambria"/>
           <w:b/>
           <w:bCs/>
-          <w:sz w:val="28"/>
-          <w:szCs w:val="28"/>
-        </w:rPr>
-        <w:lastRenderedPageBreak/>
+          <w:noProof/>
+          <w:sz w:val="28"/>
+          <w:szCs w:val="28"/>
+        </w:rPr>
         <w:drawing>
-          <wp:inline distT="0" distB="0" distL="0" distR="0" wp14:anchorId="0D52C447" wp14:editId="00FA350F">
-            <wp:extent cx="5876925" cy="3459480"/>
-            <wp:effectExtent l="0" t="0" r="9525" b="7620"/>
+          <wp:inline distT="0" distB="0" distL="0" distR="0" wp14:anchorId="0D52C447" wp14:editId="5AA8157C">
+            <wp:extent cx="5876925" cy="4556760"/>
+            <wp:effectExtent l="0" t="0" r="9525" b="0"/>
             <wp:docPr id="14" name="Picture 14" descr="A screen shot of a computer program&#10;&#10;AI-generated content may be incorrect."/>
             <wp:cNvGraphicFramePr>
               <a:graphicFrameLocks xmlns:a="http://schemas.openxmlformats.org/drawingml/2006/main" noChangeAspect="1"/>
@@ -955,7 +1091,7 @@
                   <pic:spPr>
                     <a:xfrm>
                       <a:off x="0" y="0"/>
-                      <a:ext cx="5876925" cy="3459480"/>
+                      <a:ext cx="5876925" cy="4556760"/>
                     </a:xfrm>
                     <a:prstGeom prst="rect">
                       <a:avLst/>
@@ -1028,6 +1164,7 @@
         <w:t xml:space="preserve">Planet, which is the object it orbits. In </w:t>
       </w:r>
       <w:proofErr w:type="spellStart"/>
+      <w:proofErr w:type="gramStart"/>
       <w:r>
         <w:rPr>
           <w:rFonts w:ascii="Cambria" w:eastAsia="Calibri" w:hAnsi="Cambria"/>
@@ -1043,7 +1180,16 @@
           <w:b/>
           <w:bCs/>
         </w:rPr>
-        <w:t>(), the moon first gets the current position of its parent, then adds its own circular offset using cos and sin. This makes the moon follow the parent while still orbiting around it. When drawing, the code first translates to the parent’s position, then rotates by the moon’s orbit angle, moves outward by the orbit distance, and finally rotates the moon around its own axis, effectively making the Moon orbit the Earth which orbits the Sun in perfect harmony.</w:t>
+        <w:t>(</w:t>
+      </w:r>
+      <w:proofErr w:type="gramEnd"/>
+      <w:r>
+        <w:rPr>
+          <w:rFonts w:ascii="Cambria" w:eastAsia="Calibri" w:hAnsi="Cambria"/>
+          <w:b/>
+          <w:bCs/>
+        </w:rPr>
+        <w:t>), the moon first gets the current position of its parent, then adds its own circular offset using cos and sin. This makes the moon follow the parent while still orbiting around it. When drawing, the code first translates to the parent’s position, then rotates by the moon’s orbit angle, moves outward by the orbit distance, and finally rotates the moon around its own axis, effectively making the Moon orbit the Earth which orbits the Sun in perfect harmony.</w:t>
       </w:r>
     </w:p>
     <w:p>
@@ -1060,7 +1206,12 @@
           <w:u w:val="single"/>
         </w:rPr>
       </w:pPr>
-      <w:r>
+    </w:p>
+    <w:p>
+      <w:pPr>
+        <w:pStyle w:val="BodyText"/>
+        <w:ind w:left="360"/>
+        <w:jc w:val="both"/>
         <w:rPr>
           <w:rFonts w:ascii="Cambria" w:eastAsia="Calibri" w:hAnsi="Cambria"/>
           <w:b/>
@@ -1069,6 +1220,46 @@
           <w:szCs w:val="28"/>
           <w:u w:val="single"/>
         </w:rPr>
+      </w:pPr>
+    </w:p>
+    <w:p>
+      <w:pPr>
+        <w:pStyle w:val="BodyText"/>
+        <w:ind w:left="360"/>
+        <w:jc w:val="both"/>
+        <w:rPr>
+          <w:rFonts w:ascii="Cambria" w:eastAsia="Calibri" w:hAnsi="Cambria"/>
+          <w:b/>
+          <w:bCs/>
+          <w:sz w:val="28"/>
+          <w:szCs w:val="28"/>
+          <w:u w:val="single"/>
+        </w:rPr>
+      </w:pPr>
+    </w:p>
+    <w:p>
+      <w:pPr>
+        <w:pStyle w:val="BodyText"/>
+        <w:ind w:left="360"/>
+        <w:jc w:val="both"/>
+        <w:rPr>
+          <w:rFonts w:ascii="Cambria" w:eastAsia="Calibri" w:hAnsi="Cambria"/>
+          <w:b/>
+          <w:bCs/>
+          <w:sz w:val="28"/>
+          <w:szCs w:val="28"/>
+          <w:u w:val="single"/>
+        </w:rPr>
+      </w:pPr>
+      <w:r>
+        <w:rPr>
+          <w:rFonts w:ascii="Cambria" w:eastAsia="Calibri" w:hAnsi="Cambria"/>
+          <w:b/>
+          <w:bCs/>
+          <w:sz w:val="28"/>
+          <w:szCs w:val="28"/>
+          <w:u w:val="single"/>
+        </w:rPr>
         <w:t>Planet Rings:</w:t>
       </w:r>
     </w:p>
@@ -1088,11 +1279,11 @@
           <w:rFonts w:ascii="Cambria" w:eastAsia="Calibri" w:hAnsi="Cambria"/>
           <w:b/>
           <w:bCs/>
-        </w:rPr>
-        <w:lastRenderedPageBreak/>
+          <w:noProof/>
+        </w:rPr>
         <w:drawing>
-          <wp:inline distT="0" distB="0" distL="0" distR="0" wp14:anchorId="15C74DDA" wp14:editId="081FD2C1">
-            <wp:extent cx="5876925" cy="3414395"/>
+          <wp:inline distT="0" distB="0" distL="0" distR="0" wp14:anchorId="15C74DDA" wp14:editId="41BD731D">
+            <wp:extent cx="5876925" cy="4229100"/>
             <wp:effectExtent l="0" t="0" r="9525" b="0"/>
             <wp:docPr id="16" name="Picture 16" descr="A screen shot of a computer program&#10;&#10;AI-generated content may be incorrect."/>
             <wp:cNvGraphicFramePr>
@@ -1114,7 +1305,7 @@
                   <pic:spPr>
                     <a:xfrm>
                       <a:off x="0" y="0"/>
-                      <a:ext cx="5876925" cy="3414395"/>
+                      <a:ext cx="5876925" cy="4229100"/>
                     </a:xfrm>
                     <a:prstGeom prst="rect">
                       <a:avLst/>
@@ -1186,7 +1377,25 @@
           <w:b/>
           <w:bCs/>
         </w:rPr>
-        <w:t xml:space="preserve">. This allows the ring to follow the planet it belongs to. In the draw() function, the ring first gets the parent planet’s current position, then calculates an </w:t>
+        <w:t xml:space="preserve">. This allows the ring to follow the planet it belongs to. In the </w:t>
+      </w:r>
+      <w:proofErr w:type="gramStart"/>
+      <w:r>
+        <w:rPr>
+          <w:rFonts w:ascii="Cambria" w:eastAsia="Calibri" w:hAnsi="Cambria"/>
+          <w:b/>
+          <w:bCs/>
+        </w:rPr>
+        <w:t>draw(</w:t>
+      </w:r>
+      <w:proofErr w:type="gramEnd"/>
+      <w:r>
+        <w:rPr>
+          <w:rFonts w:ascii="Cambria" w:eastAsia="Calibri" w:hAnsi="Cambria"/>
+          <w:b/>
+          <w:bCs/>
+        </w:rPr>
+        <w:t xml:space="preserve">) function, the ring first gets the parent planet’s current position, then calculates an </w:t>
       </w:r>
       <w:proofErr w:type="spellStart"/>
       <w:r>
@@ -1225,6 +1434,7 @@
         <w:t xml:space="preserve"> to control the ring’s thickness. The code uses </w:t>
       </w:r>
       <w:proofErr w:type="spellStart"/>
+      <w:proofErr w:type="gramStart"/>
       <w:r>
         <w:rPr>
           <w:rFonts w:ascii="Cambria" w:eastAsia="Calibri" w:hAnsi="Cambria"/>
@@ -1240,7 +1450,16 @@
           <w:b/>
           <w:bCs/>
         </w:rPr>
-        <w:t>() to move the ring to the planet’s position, then applies rotations so the ring is placed correctly around the planet. The ring itself is drawn using GL_QUAD_STRIP, the circular shape is made using cos and sin, and connecting all the inner and outer points creates a flat band around the planet.</w:t>
+        <w:t>(</w:t>
+      </w:r>
+      <w:proofErr w:type="gramEnd"/>
+      <w:r>
+        <w:rPr>
+          <w:rFonts w:ascii="Cambria" w:eastAsia="Calibri" w:hAnsi="Cambria"/>
+          <w:b/>
+          <w:bCs/>
+        </w:rPr>
+        <w:t>) to move the ring to the planet’s position, then applies rotations so the ring is placed correctly around the planet. The ring itself is drawn using GL_QUAD_STRIP, the circular shape is made using cos and sin, and connecting all the inner and outer points creates a flat band around the planet.</w:t>
       </w:r>
     </w:p>
     <w:p>
@@ -1266,6 +1485,7 @@
           <w:szCs w:val="28"/>
           <w:u w:val="single"/>
         </w:rPr>
+        <w:lastRenderedPageBreak/>
         <w:t>Stars:</w:t>
       </w:r>
     </w:p>
@@ -1285,8 +1505,249 @@
           <w:rFonts w:ascii="Cambria" w:eastAsia="Calibri" w:hAnsi="Cambria"/>
           <w:b/>
           <w:bCs/>
-        </w:rPr>
-        <w:t>Photo &amp; Text</w:t>
+          <w:noProof/>
+        </w:rPr>
+        <w:drawing>
+          <wp:inline distT="0" distB="0" distL="0" distR="0" wp14:anchorId="004055FC" wp14:editId="158F3BA5">
+            <wp:extent cx="5196840" cy="3935111"/>
+            <wp:effectExtent l="0" t="0" r="3810" b="8255"/>
+            <wp:docPr id="6" name="Picture 6"/>
+            <wp:cNvGraphicFramePr>
+              <a:graphicFrameLocks xmlns:a="http://schemas.openxmlformats.org/drawingml/2006/main" noChangeAspect="1"/>
+            </wp:cNvGraphicFramePr>
+            <a:graphic xmlns:a="http://schemas.openxmlformats.org/drawingml/2006/main">
+              <a:graphicData uri="http://schemas.openxmlformats.org/drawingml/2006/picture">
+                <pic:pic xmlns:pic="http://schemas.openxmlformats.org/drawingml/2006/picture">
+                  <pic:nvPicPr>
+                    <pic:cNvPr id="6" name="Stars.png"/>
+                    <pic:cNvPicPr/>
+                  </pic:nvPicPr>
+                  <pic:blipFill>
+                    <a:blip r:embed="rId15">
+                      <a:extLst>
+                        <a:ext uri="{28A0092B-C50C-407E-A947-70E740481C1C}">
+                          <a14:useLocalDpi xmlns:a14="http://schemas.microsoft.com/office/drawing/2010/main" val="0"/>
+                        </a:ext>
+                      </a:extLst>
+                    </a:blip>
+                    <a:stretch>
+                      <a:fillRect/>
+                    </a:stretch>
+                  </pic:blipFill>
+                  <pic:spPr>
+                    <a:xfrm>
+                      <a:off x="0" y="0"/>
+                      <a:ext cx="5264051" cy="3986004"/>
+                    </a:xfrm>
+                    <a:prstGeom prst="rect">
+                      <a:avLst/>
+                    </a:prstGeom>
+                  </pic:spPr>
+                </pic:pic>
+              </a:graphicData>
+            </a:graphic>
+          </wp:inline>
+        </w:drawing>
+      </w:r>
+    </w:p>
+    <w:p>
+      <w:pPr>
+        <w:pStyle w:val="BodyText"/>
+        <w:ind w:left="720" w:hanging="360"/>
+        <w:jc w:val="both"/>
+        <w:rPr>
+          <w:rFonts w:ascii="Cambria" w:eastAsia="Calibri" w:hAnsi="Cambria"/>
+          <w:b/>
+          <w:bCs/>
+          <w:i/>
+          <w:sz w:val="28"/>
+          <w:szCs w:val="28"/>
+        </w:rPr>
+      </w:pPr>
+      <w:r>
+        <w:rPr>
+          <w:rFonts w:ascii="Cambria" w:eastAsia="Calibri" w:hAnsi="Cambria"/>
+          <w:b/>
+          <w:bCs/>
+          <w:i/>
+          <w:sz w:val="28"/>
+          <w:szCs w:val="28"/>
+        </w:rPr>
+        <w:t>6a: a snippet of code that is used to make the stars of our simulation</w:t>
+      </w:r>
+    </w:p>
+    <w:p>
+      <w:pPr>
+        <w:pStyle w:val="BodyText"/>
+        <w:ind w:left="720" w:hanging="360"/>
+        <w:jc w:val="both"/>
+        <w:rPr>
+          <w:rFonts w:ascii="Cambria" w:eastAsia="Calibri" w:hAnsi="Cambria"/>
+          <w:b/>
+          <w:bCs/>
+          <w:sz w:val="28"/>
+          <w:szCs w:val="28"/>
+        </w:rPr>
+      </w:pPr>
+      <w:r>
+        <w:rPr>
+          <w:rFonts w:ascii="Cambria" w:eastAsia="Calibri" w:hAnsi="Cambria"/>
+          <w:b/>
+          <w:bCs/>
+          <w:sz w:val="28"/>
+          <w:szCs w:val="28"/>
+        </w:rPr>
+        <w:t>The stars work on a 2 step-plan, generation and drawing.</w:t>
+      </w:r>
+    </w:p>
+    <w:p>
+      <w:pPr>
+        <w:pStyle w:val="BodyText"/>
+        <w:ind w:left="720" w:hanging="360"/>
+        <w:jc w:val="both"/>
+        <w:rPr>
+          <w:rFonts w:ascii="Cambria" w:eastAsia="Calibri" w:hAnsi="Cambria"/>
+          <w:b/>
+          <w:bCs/>
+          <w:sz w:val="28"/>
+          <w:szCs w:val="28"/>
+        </w:rPr>
+      </w:pPr>
+      <w:r>
+        <w:rPr>
+          <w:rFonts w:ascii="Cambria" w:eastAsia="Calibri" w:hAnsi="Cambria"/>
+          <w:b/>
+          <w:bCs/>
+          <w:sz w:val="28"/>
+          <w:szCs w:val="28"/>
+        </w:rPr>
+        <w:t>First, we must generate the star, which is done with the use of random values, the idea is to scatter point inside of a grand sphere so sporadically they give the appearance of stars.</w:t>
+      </w:r>
+      <w:r>
+        <w:rPr>
+          <w:rFonts w:ascii="Cambria" w:eastAsia="Calibri" w:hAnsi="Cambria"/>
+          <w:b/>
+          <w:bCs/>
+          <w:sz w:val="28"/>
+          <w:szCs w:val="28"/>
+        </w:rPr>
+        <w:t xml:space="preserve"> </w:t>
+      </w:r>
+      <w:r>
+        <w:rPr>
+          <w:rFonts w:ascii="Cambria" w:eastAsia="Calibri" w:hAnsi="Cambria"/>
+          <w:b/>
+          <w:bCs/>
+          <w:sz w:val="28"/>
+          <w:szCs w:val="28"/>
+        </w:rPr>
+        <w:t>We achieve this by using some sphere arithmetic. We start by randomizing 3 values, a theta, phi and radius (aka horizontal, vertical and distance from center)</w:t>
+      </w:r>
+      <w:r>
+        <w:rPr>
+          <w:rFonts w:ascii="Cambria" w:eastAsia="Calibri" w:hAnsi="Cambria"/>
+          <w:b/>
+          <w:bCs/>
+          <w:sz w:val="28"/>
+          <w:szCs w:val="28"/>
+        </w:rPr>
+        <w:t>.</w:t>
+      </w:r>
+      <w:r>
+        <w:rPr>
+          <w:rFonts w:ascii="Cambria" w:eastAsia="Calibri" w:hAnsi="Cambria"/>
+          <w:b/>
+          <w:bCs/>
+          <w:sz w:val="28"/>
+          <w:szCs w:val="28"/>
+        </w:rPr>
+        <w:t xml:space="preserve"> Then </w:t>
+      </w:r>
+      <w:r>
+        <w:rPr>
+          <w:rFonts w:ascii="Cambria" w:eastAsia="Calibri" w:hAnsi="Cambria"/>
+          <w:b/>
+          <w:bCs/>
+          <w:sz w:val="28"/>
+          <w:szCs w:val="28"/>
+        </w:rPr>
+        <w:t xml:space="preserve">with </w:t>
+      </w:r>
+      <w:r>
+        <w:rPr>
+          <w:rFonts w:ascii="Cambria" w:eastAsia="Calibri" w:hAnsi="Cambria"/>
+          <w:b/>
+          <w:bCs/>
+          <w:sz w:val="28"/>
+          <w:szCs w:val="28"/>
+        </w:rPr>
+        <w:t>these three values we can determine a point</w:t>
+      </w:r>
+      <w:r>
+        <w:rPr>
+          <w:rFonts w:ascii="Cambria" w:eastAsia="Calibri" w:hAnsi="Cambria"/>
+          <w:b/>
+          <w:bCs/>
+          <w:sz w:val="28"/>
+          <w:szCs w:val="28"/>
+        </w:rPr>
+        <w:t xml:space="preserve"> in 3D space</w:t>
+      </w:r>
+      <w:r>
+        <w:rPr>
+          <w:rFonts w:ascii="Cambria" w:eastAsia="Calibri" w:hAnsi="Cambria"/>
+          <w:b/>
+          <w:bCs/>
+          <w:sz w:val="28"/>
+          <w:szCs w:val="28"/>
+        </w:rPr>
+        <w:t xml:space="preserve"> as seen above in figure 6a.</w:t>
+      </w:r>
+    </w:p>
+    <w:p>
+      <w:pPr>
+        <w:pStyle w:val="BodyText"/>
+        <w:ind w:left="720" w:hanging="360"/>
+        <w:jc w:val="both"/>
+        <w:rPr>
+          <w:rFonts w:ascii="Cambria" w:eastAsia="Calibri" w:hAnsi="Cambria"/>
+          <w:b/>
+          <w:bCs/>
+          <w:sz w:val="28"/>
+          <w:szCs w:val="28"/>
+        </w:rPr>
+      </w:pPr>
+      <w:r>
+        <w:rPr>
+          <w:rFonts w:ascii="Cambria" w:eastAsia="Calibri" w:hAnsi="Cambria"/>
+          <w:b/>
+          <w:bCs/>
+          <w:sz w:val="28"/>
+          <w:szCs w:val="28"/>
+        </w:rPr>
+        <w:t>Second we must draw these stars, which is done through a batch draw of GL_POINTS, we would like to note that it’s possible to randomize the “brightness” of these stars by adding a random variable that is used to alter the glColor3</w:t>
+      </w:r>
+      <w:proofErr w:type="gramStart"/>
+      <w:r>
+        <w:rPr>
+          <w:rFonts w:ascii="Cambria" w:eastAsia="Calibri" w:hAnsi="Cambria"/>
+          <w:b/>
+          <w:bCs/>
+          <w:sz w:val="28"/>
+          <w:szCs w:val="28"/>
+        </w:rPr>
+        <w:t>f(</w:t>
+      </w:r>
+      <w:proofErr w:type="gramEnd"/>
+      <w:r>
+        <w:rPr>
+          <w:rFonts w:ascii="Cambria" w:eastAsia="Calibri" w:hAnsi="Cambria"/>
+          <w:b/>
+          <w:bCs/>
+          <w:sz w:val="28"/>
+          <w:szCs w:val="28"/>
+        </w:rPr>
+        <w:t>) arguments.</w:t>
       </w:r>
     </w:p>
     <w:p>
@@ -1312,6 +1773,7 @@
           <w:szCs w:val="28"/>
           <w:u w:val="single"/>
         </w:rPr>
+        <w:lastRenderedPageBreak/>
         <w:t>Space Background (Skybox):</w:t>
       </w:r>
     </w:p>
@@ -1332,7 +1794,200 @@
           <w:b/>
           <w:bCs/>
         </w:rPr>
-        <w:t>Photo &amp; Text</w:t>
+        <w:t xml:space="preserve">A skybox is as the name implies a box in the sky. Which is exactly what we do to create our own by modeling and drawing a cube to act as the absolute background while covering up the </w:t>
+      </w:r>
+      <w:proofErr w:type="spellStart"/>
+      <w:r>
+        <w:rPr>
+          <w:rFonts w:ascii="Cambria" w:eastAsia="Calibri" w:hAnsi="Cambria"/>
+          <w:b/>
+          <w:bCs/>
+        </w:rPr>
+        <w:t>seems</w:t>
+      </w:r>
+      <w:proofErr w:type="spellEnd"/>
+      <w:r>
+        <w:rPr>
+          <w:rFonts w:ascii="Cambria" w:eastAsia="Calibri" w:hAnsi="Cambria"/>
+          <w:b/>
+          <w:bCs/>
+        </w:rPr>
+        <w:t xml:space="preserve"> between one image and its surrounding 4 we can achieve a visually seamless 360 3D environment</w:t>
+      </w:r>
+    </w:p>
+    <w:p>
+      <w:pPr>
+        <w:pStyle w:val="BodyText"/>
+        <w:ind w:left="360"/>
+        <w:jc w:val="both"/>
+        <w:rPr>
+          <w:rFonts w:ascii="Cambria" w:eastAsia="Calibri" w:hAnsi="Cambria"/>
+          <w:b/>
+          <w:bCs/>
+        </w:rPr>
+      </w:pPr>
+      <w:r>
+        <w:rPr>
+          <w:rFonts w:ascii="Cambria" w:eastAsia="Calibri" w:hAnsi="Cambria"/>
+          <w:b/>
+          <w:bCs/>
+          <w:noProof/>
+        </w:rPr>
+        <w:drawing>
+          <wp:inline distT="0" distB="0" distL="0" distR="0" wp14:anchorId="306888CB" wp14:editId="4604C347">
+            <wp:extent cx="5876925" cy="3390900"/>
+            <wp:effectExtent l="0" t="0" r="9525" b="0"/>
+            <wp:docPr id="11" name="Picture 11"/>
+            <wp:cNvGraphicFramePr>
+              <a:graphicFrameLocks xmlns:a="http://schemas.openxmlformats.org/drawingml/2006/main" noChangeAspect="1"/>
+            </wp:cNvGraphicFramePr>
+            <a:graphic xmlns:a="http://schemas.openxmlformats.org/drawingml/2006/main">
+              <a:graphicData uri="http://schemas.openxmlformats.org/drawingml/2006/picture">
+                <pic:pic xmlns:pic="http://schemas.openxmlformats.org/drawingml/2006/picture">
+                  <pic:nvPicPr>
+                    <pic:cNvPr id="11" name="Skybox1.png"/>
+                    <pic:cNvPicPr/>
+                  </pic:nvPicPr>
+                  <pic:blipFill>
+                    <a:blip r:embed="rId16">
+                      <a:extLst>
+                        <a:ext uri="{28A0092B-C50C-407E-A947-70E740481C1C}">
+                          <a14:useLocalDpi xmlns:a14="http://schemas.microsoft.com/office/drawing/2010/main" val="0"/>
+                        </a:ext>
+                      </a:extLst>
+                    </a:blip>
+                    <a:stretch>
+                      <a:fillRect/>
+                    </a:stretch>
+                  </pic:blipFill>
+                  <pic:spPr>
+                    <a:xfrm>
+                      <a:off x="0" y="0"/>
+                      <a:ext cx="5876925" cy="3390900"/>
+                    </a:xfrm>
+                    <a:prstGeom prst="rect">
+                      <a:avLst/>
+                    </a:prstGeom>
+                  </pic:spPr>
+                </pic:pic>
+              </a:graphicData>
+            </a:graphic>
+          </wp:inline>
+        </w:drawing>
+      </w:r>
+    </w:p>
+    <w:p>
+      <w:pPr>
+        <w:pStyle w:val="BodyText"/>
+        <w:ind w:left="360"/>
+        <w:jc w:val="both"/>
+        <w:rPr>
+          <w:rFonts w:ascii="Cambria" w:eastAsia="Calibri" w:hAnsi="Cambria"/>
+          <w:b/>
+          <w:bCs/>
+          <w:i/>
+        </w:rPr>
+      </w:pPr>
+      <w:r>
+        <w:rPr>
+          <w:rFonts w:ascii="Cambria" w:eastAsia="Calibri" w:hAnsi="Cambria"/>
+          <w:b/>
+          <w:bCs/>
+          <w:i/>
+        </w:rPr>
+        <w:t>7a: a snippet of code used to read the texture data for the skybox</w:t>
+      </w:r>
+    </w:p>
+    <w:p>
+      <w:pPr>
+        <w:pStyle w:val="BodyText"/>
+        <w:ind w:left="360"/>
+        <w:jc w:val="both"/>
+        <w:rPr>
+          <w:rFonts w:ascii="Cambria" w:eastAsia="Calibri" w:hAnsi="Cambria"/>
+          <w:b/>
+          <w:bCs/>
+        </w:rPr>
+      </w:pPr>
+      <w:r>
+        <w:rPr>
+          <w:rFonts w:ascii="Cambria" w:eastAsia="Calibri" w:hAnsi="Cambria"/>
+          <w:b/>
+          <w:bCs/>
+        </w:rPr>
+        <w:t>To draw the images we need the data associated we use this function as a helper that at the start of the program retrieves from our assets file 6 files (back.png, front.png, top.png, bottom.</w:t>
+      </w:r>
+      <w:r>
+        <w:rPr>
+          <w:rFonts w:ascii="Cambria" w:eastAsia="Calibri" w:hAnsi="Cambria"/>
+          <w:b/>
+          <w:bCs/>
+        </w:rPr>
+        <w:t>png, left.png, right.png), this is done through the following for loop in the main function that loads each files in a unique id.</w:t>
+      </w:r>
+      <w:r>
+        <w:rPr>
+          <w:rFonts w:ascii="Cambria" w:eastAsia="Calibri" w:hAnsi="Cambria"/>
+          <w:b/>
+          <w:bCs/>
+        </w:rPr>
+        <w:drawing>
+          <wp:inline distT="0" distB="0" distL="0" distR="0" wp14:anchorId="4898639F" wp14:editId="3D00616E">
+            <wp:extent cx="5876925" cy="1601470"/>
+            <wp:effectExtent l="0" t="0" r="9525" b="0"/>
+            <wp:docPr id="13" name="Picture 13"/>
+            <wp:cNvGraphicFramePr>
+              <a:graphicFrameLocks xmlns:a="http://schemas.openxmlformats.org/drawingml/2006/main" noChangeAspect="1"/>
+            </wp:cNvGraphicFramePr>
+            <a:graphic xmlns:a="http://schemas.openxmlformats.org/drawingml/2006/main">
+              <a:graphicData uri="http://schemas.openxmlformats.org/drawingml/2006/picture">
+                <pic:pic xmlns:pic="http://schemas.openxmlformats.org/drawingml/2006/picture">
+                  <pic:nvPicPr>
+                    <pic:cNvPr id="1" name=""/>
+                    <pic:cNvPicPr/>
+                  </pic:nvPicPr>
+                  <pic:blipFill>
+                    <a:blip r:embed="rId17"/>
+                    <a:stretch>
+                      <a:fillRect/>
+                    </a:stretch>
+                  </pic:blipFill>
+                  <pic:spPr>
+                    <a:xfrm>
+                      <a:off x="0" y="0"/>
+                      <a:ext cx="5876925" cy="1601470"/>
+                    </a:xfrm>
+                    <a:prstGeom prst="rect">
+                      <a:avLst/>
+                    </a:prstGeom>
+                  </pic:spPr>
+                </pic:pic>
+              </a:graphicData>
+            </a:graphic>
+          </wp:inline>
+        </w:drawing>
+      </w:r>
+    </w:p>
+    <w:p>
+      <w:pPr>
+        <w:pStyle w:val="BodyText"/>
+        <w:ind w:left="360"/>
+        <w:jc w:val="both"/>
+        <w:rPr>
+          <w:rFonts w:ascii="Cambria" w:eastAsia="Calibri" w:hAnsi="Cambria"/>
+          <w:b/>
+          <w:bCs/>
+          <w:i/>
+        </w:rPr>
+      </w:pPr>
+      <w:r>
+        <w:rPr>
+          <w:rFonts w:ascii="Cambria" w:eastAsia="Calibri" w:hAnsi="Cambria"/>
+          <w:b/>
+          <w:bCs/>
+          <w:i/>
+        </w:rPr>
+        <w:t>7b: snippet of code from main that handles loading skybox texture</w:t>
       </w:r>
     </w:p>
     <w:p>
@@ -1358,6 +2013,153 @@
           <w:szCs w:val="28"/>
           <w:u w:val="single"/>
         </w:rPr>
+        <w:lastRenderedPageBreak/>
+        <w:drawing>
+          <wp:inline distT="0" distB="0" distL="0" distR="0" wp14:anchorId="58C5F9A8" wp14:editId="3E07999E">
+            <wp:extent cx="5744377" cy="5772956"/>
+            <wp:effectExtent l="0" t="0" r="8890" b="0"/>
+            <wp:docPr id="18" name="Picture 18"/>
+            <wp:cNvGraphicFramePr>
+              <a:graphicFrameLocks xmlns:a="http://schemas.openxmlformats.org/drawingml/2006/main" noChangeAspect="1"/>
+            </wp:cNvGraphicFramePr>
+            <a:graphic xmlns:a="http://schemas.openxmlformats.org/drawingml/2006/main">
+              <a:graphicData uri="http://schemas.openxmlformats.org/drawingml/2006/picture">
+                <pic:pic xmlns:pic="http://schemas.openxmlformats.org/drawingml/2006/picture">
+                  <pic:nvPicPr>
+                    <pic:cNvPr id="1" name=""/>
+                    <pic:cNvPicPr/>
+                  </pic:nvPicPr>
+                  <pic:blipFill>
+                    <a:blip r:embed="rId18"/>
+                    <a:stretch>
+                      <a:fillRect/>
+                    </a:stretch>
+                  </pic:blipFill>
+                  <pic:spPr>
+                    <a:xfrm>
+                      <a:off x="0" y="0"/>
+                      <a:ext cx="5744377" cy="5772956"/>
+                    </a:xfrm>
+                    <a:prstGeom prst="rect">
+                      <a:avLst/>
+                    </a:prstGeom>
+                  </pic:spPr>
+                </pic:pic>
+              </a:graphicData>
+            </a:graphic>
+          </wp:inline>
+        </w:drawing>
+      </w:r>
+    </w:p>
+    <w:p>
+      <w:pPr>
+        <w:pStyle w:val="BodyText"/>
+        <w:ind w:left="360"/>
+        <w:jc w:val="both"/>
+        <w:rPr>
+          <w:rFonts w:ascii="Cambria" w:eastAsia="Calibri" w:hAnsi="Cambria"/>
+          <w:b/>
+          <w:bCs/>
+          <w:sz w:val="28"/>
+          <w:szCs w:val="28"/>
+        </w:rPr>
+      </w:pPr>
+      <w:r>
+        <w:rPr>
+          <w:rFonts w:ascii="Cambria" w:eastAsia="Calibri" w:hAnsi="Cambria"/>
+          <w:b/>
+          <w:bCs/>
+          <w:i/>
+          <w:sz w:val="28"/>
+          <w:szCs w:val="28"/>
+        </w:rPr>
+        <w:t>7c: snippet of code that is use to draw the loaded textures</w:t>
+      </w:r>
+      <w:r>
+        <w:rPr>
+          <w:rFonts w:ascii="Cambria" w:eastAsia="Calibri" w:hAnsi="Cambria"/>
+          <w:b/>
+          <w:bCs/>
+          <w:i/>
+          <w:sz w:val="28"/>
+          <w:szCs w:val="28"/>
+        </w:rPr>
+        <w:br/>
+      </w:r>
+      <w:r>
+        <w:rPr>
+          <w:rFonts w:ascii="Cambria" w:eastAsia="Calibri" w:hAnsi="Cambria"/>
+          <w:b/>
+          <w:bCs/>
+          <w:sz w:val="28"/>
+          <w:szCs w:val="28"/>
+        </w:rPr>
+        <w:t>This code represents the sets taken to draw the skybox. (due to time constraints the function had to be hard coded instead of made in a more dynamic fashion through a loop)</w:t>
+      </w:r>
+    </w:p>
+    <w:p>
+      <w:pPr>
+        <w:pStyle w:val="BodyText"/>
+        <w:ind w:left="360"/>
+        <w:jc w:val="both"/>
+        <w:rPr>
+          <w:rFonts w:ascii="Cambria" w:eastAsia="Calibri" w:hAnsi="Cambria"/>
+          <w:b/>
+          <w:bCs/>
+          <w:sz w:val="28"/>
+          <w:szCs w:val="28"/>
+        </w:rPr>
+      </w:pPr>
+      <w:r>
+        <w:rPr>
+          <w:rFonts w:ascii="Cambria" w:eastAsia="Calibri" w:hAnsi="Cambria"/>
+          <w:b/>
+          <w:bCs/>
+          <w:sz w:val="28"/>
+          <w:szCs w:val="28"/>
+        </w:rPr>
+        <w:t>First bind a texture to the GL_TEXTURE_2D bit, then draw GL_QUADS to display the texture</w:t>
+      </w:r>
+    </w:p>
+    <w:p>
+      <w:pPr>
+        <w:pStyle w:val="BodyText"/>
+        <w:ind w:left="360"/>
+        <w:jc w:val="both"/>
+        <w:rPr>
+          <w:rFonts w:ascii="Cambria" w:eastAsia="Calibri" w:hAnsi="Cambria"/>
+          <w:b/>
+          <w:bCs/>
+          <w:sz w:val="28"/>
+          <w:szCs w:val="28"/>
+          <w:u w:val="single"/>
+        </w:rPr>
+      </w:pPr>
+    </w:p>
+    <w:p>
+      <w:pPr>
+        <w:pStyle w:val="BodyText"/>
+        <w:ind w:left="360"/>
+        <w:jc w:val="both"/>
+        <w:rPr>
+          <w:rFonts w:ascii="Cambria" w:eastAsia="Calibri" w:hAnsi="Cambria"/>
+          <w:b/>
+          <w:bCs/>
+          <w:sz w:val="28"/>
+          <w:szCs w:val="28"/>
+          <w:u w:val="single"/>
+        </w:rPr>
+      </w:pPr>
+      <w:r>
+        <w:rPr>
+          <w:rFonts w:ascii="Cambria" w:eastAsia="Calibri" w:hAnsi="Cambria"/>
+          <w:b/>
+          <w:bCs/>
+          <w:sz w:val="28"/>
+          <w:szCs w:val="28"/>
+          <w:u w:val="single"/>
+        </w:rPr>
+        <w:lastRenderedPageBreak/>
         <w:t>Interactive Camera:</w:t>
       </w:r>
     </w:p>
@@ -1370,64 +2172,871 @@
           <w:rFonts w:ascii="Cambria" w:eastAsia="Calibri" w:hAnsi="Cambria"/>
           <w:b/>
           <w:bCs/>
-        </w:rPr>
-      </w:pPr>
-      <w:r>
-        <w:rPr>
-          <w:rFonts w:ascii="Cambria" w:eastAsia="Calibri" w:hAnsi="Cambria"/>
-          <w:b/>
-          <w:bCs/>
-        </w:rPr>
-        <w:t>Photo &amp; Text</w:t>
-      </w:r>
-    </w:p>
-    <w:p>
-      <w:pPr>
-        <w:pStyle w:val="BodyText"/>
-        <w:ind w:left="360"/>
-        <w:jc w:val="both"/>
-        <w:rPr>
-          <w:rFonts w:ascii="Cambria" w:eastAsia="Calibri" w:hAnsi="Cambria"/>
-          <w:b/>
-          <w:bCs/>
-        </w:rPr>
-      </w:pPr>
-    </w:p>
-    <w:p>
-      <w:pPr>
-        <w:pStyle w:val="Title"/>
-        <w:numPr>
-          <w:ilvl w:val="0"/>
-          <w:numId w:val="1"/>
-        </w:numPr>
-        <w:rPr>
-          <w:b/>
-          <w:bCs/>
-          <w:sz w:val="24"/>
-          <w:szCs w:val="24"/>
-        </w:rPr>
-      </w:pPr>
-      <w:r>
-        <w:rPr>
-          <w:b/>
-          <w:bCs/>
-          <w:sz w:val="24"/>
-          <w:szCs w:val="24"/>
-        </w:rPr>
-        <w:t>Experimentations and Results</w:t>
-      </w:r>
-    </w:p>
-    <w:p>
-      <w:pPr>
-        <w:pStyle w:val="BodyText"/>
-        <w:ind w:left="360"/>
-        <w:jc w:val="both"/>
-        <w:rPr>
-          <w:rFonts w:ascii="Cambria" w:eastAsia="Calibri" w:hAnsi="Cambria"/>
-          <w:b/>
-          <w:bCs/>
-          <w:sz w:val="28"/>
-          <w:szCs w:val="28"/>
+          <w:sz w:val="28"/>
+          <w:szCs w:val="28"/>
+        </w:rPr>
+      </w:pPr>
+      <w:r>
+        <w:rPr>
+          <w:rFonts w:ascii="Cambria" w:eastAsia="Calibri" w:hAnsi="Cambria"/>
+          <w:b/>
+          <w:bCs/>
+          <w:sz w:val="28"/>
+          <w:szCs w:val="28"/>
+        </w:rPr>
+        <w:t xml:space="preserve">A 3D Interactive camera is a very complex and intricate thing that is often taken for granted, in this section we will explain some of the major functions that went into making our own functional interactive camera (make sure to click “r” to switch to camera mode) </w:t>
+      </w:r>
+    </w:p>
+    <w:p>
+      <w:pPr>
+        <w:pStyle w:val="BodyText"/>
+        <w:ind w:left="360"/>
+        <w:jc w:val="both"/>
+        <w:rPr>
+          <w:rFonts w:ascii="Cambria" w:eastAsia="Calibri" w:hAnsi="Cambria"/>
+          <w:b/>
+          <w:bCs/>
+        </w:rPr>
+      </w:pPr>
+      <w:r>
+        <w:rPr>
+          <w:rFonts w:ascii="Cambria" w:eastAsia="Calibri" w:hAnsi="Cambria"/>
+          <w:b/>
+          <w:bCs/>
+          <w:noProof/>
+        </w:rPr>
+        <w:drawing>
+          <wp:inline distT="0" distB="0" distL="0" distR="0" wp14:anchorId="095EDBDB" wp14:editId="18956140">
+            <wp:extent cx="4888769" cy="2865120"/>
+            <wp:effectExtent l="0" t="0" r="7620" b="0"/>
+            <wp:docPr id="19" name="Picture 19"/>
+            <wp:cNvGraphicFramePr>
+              <a:graphicFrameLocks xmlns:a="http://schemas.openxmlformats.org/drawingml/2006/main" noChangeAspect="1"/>
+            </wp:cNvGraphicFramePr>
+            <a:graphic xmlns:a="http://schemas.openxmlformats.org/drawingml/2006/main">
+              <a:graphicData uri="http://schemas.openxmlformats.org/drawingml/2006/picture">
+                <pic:pic xmlns:pic="http://schemas.openxmlformats.org/drawingml/2006/picture">
+                  <pic:nvPicPr>
+                    <pic:cNvPr id="19" name="Mouse.png"/>
+                    <pic:cNvPicPr/>
+                  </pic:nvPicPr>
+                  <pic:blipFill>
+                    <a:blip r:embed="rId19">
+                      <a:extLst>
+                        <a:ext uri="{28A0092B-C50C-407E-A947-70E740481C1C}">
+                          <a14:useLocalDpi xmlns:a14="http://schemas.microsoft.com/office/drawing/2010/main" val="0"/>
+                        </a:ext>
+                      </a:extLst>
+                    </a:blip>
+                    <a:stretch>
+                      <a:fillRect/>
+                    </a:stretch>
+                  </pic:blipFill>
+                  <pic:spPr>
+                    <a:xfrm>
+                      <a:off x="0" y="0"/>
+                      <a:ext cx="4897206" cy="2870065"/>
+                    </a:xfrm>
+                    <a:prstGeom prst="rect">
+                      <a:avLst/>
+                    </a:prstGeom>
+                  </pic:spPr>
+                </pic:pic>
+              </a:graphicData>
+            </a:graphic>
+          </wp:inline>
+        </w:drawing>
+      </w:r>
+    </w:p>
+    <w:p>
+      <w:pPr>
+        <w:pStyle w:val="BodyText"/>
+        <w:ind w:left="360"/>
+        <w:jc w:val="both"/>
+        <w:rPr>
+          <w:rFonts w:ascii="Cambria" w:eastAsia="Calibri" w:hAnsi="Cambria"/>
+          <w:b/>
+          <w:bCs/>
+          <w:i/>
+        </w:rPr>
+      </w:pPr>
+      <w:r>
+        <w:rPr>
+          <w:rFonts w:ascii="Cambria" w:eastAsia="Calibri" w:hAnsi="Cambria"/>
+          <w:b/>
+          <w:bCs/>
+          <w:i/>
+        </w:rPr>
+        <w:t>8a:</w:t>
+      </w:r>
+      <w:r>
+        <w:rPr>
+          <w:rFonts w:ascii="Cambria" w:eastAsia="Calibri" w:hAnsi="Cambria"/>
+          <w:b/>
+          <w:bCs/>
+          <w:i/>
+        </w:rPr>
+        <w:t xml:space="preserve"> the function that is bound to handle any mouse </w:t>
+      </w:r>
+      <w:r>
+        <w:rPr>
+          <w:rFonts w:ascii="Cambria" w:eastAsia="Calibri" w:hAnsi="Cambria"/>
+          <w:b/>
+          <w:bCs/>
+          <w:i/>
+        </w:rPr>
+        <w:t xml:space="preserve">click </w:t>
+      </w:r>
+      <w:r>
+        <w:rPr>
+          <w:rFonts w:ascii="Cambria" w:eastAsia="Calibri" w:hAnsi="Cambria"/>
+          <w:b/>
+          <w:bCs/>
+          <w:i/>
+        </w:rPr>
+        <w:t>events detected by glut</w:t>
+      </w:r>
+    </w:p>
+    <w:p>
+      <w:pPr>
+        <w:pStyle w:val="BodyText"/>
+        <w:ind w:left="360"/>
+        <w:jc w:val="both"/>
+        <w:rPr>
+          <w:rFonts w:ascii="Cambria" w:eastAsia="Calibri" w:hAnsi="Cambria"/>
+          <w:b/>
+          <w:bCs/>
+        </w:rPr>
+      </w:pPr>
+      <w:r>
+        <w:rPr>
+          <w:rFonts w:ascii="Cambria" w:eastAsia="Calibri" w:hAnsi="Cambria"/>
+          <w:b/>
+          <w:bCs/>
+        </w:rPr>
+        <w:t>8a represents the code used to handle the ability to zoom in and out on the screen. As with most things graphics it’s just math.</w:t>
+      </w:r>
+    </w:p>
+    <w:p>
+      <w:pPr>
+        <w:pStyle w:val="BodyText"/>
+        <w:ind w:left="360"/>
+        <w:jc w:val="both"/>
+        <w:rPr>
+          <w:rFonts w:ascii="Cambria" w:eastAsia="Calibri" w:hAnsi="Cambria"/>
+          <w:b/>
+          <w:bCs/>
+        </w:rPr>
+      </w:pPr>
+      <w:r>
+        <w:rPr>
+          <w:rFonts w:ascii="Cambria" w:eastAsia="Calibri" w:hAnsi="Cambria"/>
+          <w:b/>
+          <w:bCs/>
+          <w:noProof/>
+        </w:rPr>
+        <w:drawing>
+          <wp:inline distT="0" distB="0" distL="0" distR="0" wp14:anchorId="29B253E1" wp14:editId="19F1A432">
+            <wp:extent cx="5876925" cy="1645920"/>
+            <wp:effectExtent l="0" t="0" r="9525" b="0"/>
+            <wp:docPr id="23" name="Picture 23"/>
+            <wp:cNvGraphicFramePr>
+              <a:graphicFrameLocks xmlns:a="http://schemas.openxmlformats.org/drawingml/2006/main" noChangeAspect="1"/>
+            </wp:cNvGraphicFramePr>
+            <a:graphic xmlns:a="http://schemas.openxmlformats.org/drawingml/2006/main">
+              <a:graphicData uri="http://schemas.openxmlformats.org/drawingml/2006/picture">
+                <pic:pic xmlns:pic="http://schemas.openxmlformats.org/drawingml/2006/picture">
+                  <pic:nvPicPr>
+                    <pic:cNvPr id="23" name="updateCamLook.png"/>
+                    <pic:cNvPicPr/>
+                  </pic:nvPicPr>
+                  <pic:blipFill>
+                    <a:blip r:embed="rId20">
+                      <a:extLst>
+                        <a:ext uri="{28A0092B-C50C-407E-A947-70E740481C1C}">
+                          <a14:useLocalDpi xmlns:a14="http://schemas.microsoft.com/office/drawing/2010/main" val="0"/>
+                        </a:ext>
+                      </a:extLst>
+                    </a:blip>
+                    <a:stretch>
+                      <a:fillRect/>
+                    </a:stretch>
+                  </pic:blipFill>
+                  <pic:spPr>
+                    <a:xfrm>
+                      <a:off x="0" y="0"/>
+                      <a:ext cx="5876925" cy="1645920"/>
+                    </a:xfrm>
+                    <a:prstGeom prst="rect">
+                      <a:avLst/>
+                    </a:prstGeom>
+                  </pic:spPr>
+                </pic:pic>
+              </a:graphicData>
+            </a:graphic>
+          </wp:inline>
+        </w:drawing>
+      </w:r>
+    </w:p>
+    <w:p>
+      <w:pPr>
+        <w:pStyle w:val="BodyText"/>
+        <w:ind w:left="360"/>
+        <w:jc w:val="both"/>
+        <w:rPr>
+          <w:rFonts w:ascii="Cambria" w:eastAsia="Calibri" w:hAnsi="Cambria"/>
+          <w:b/>
+          <w:bCs/>
+        </w:rPr>
+      </w:pPr>
+      <w:r>
+        <w:rPr>
+          <w:rFonts w:ascii="Cambria" w:eastAsia="Calibri" w:hAnsi="Cambria"/>
+          <w:b/>
+          <w:bCs/>
+          <w:i/>
+        </w:rPr>
+        <w:t xml:space="preserve">8b: the full function that camera is </w:t>
+      </w:r>
+      <w:r>
+        <w:rPr>
+          <w:rFonts w:ascii="Cambria" w:eastAsia="Calibri" w:hAnsi="Cambria"/>
+          <w:b/>
+          <w:bCs/>
+          <w:i/>
+        </w:rPr>
+        <w:t>actually altered by</w:t>
+      </w:r>
+      <w:r>
+        <w:rPr>
+          <w:rFonts w:ascii="Cambria" w:eastAsia="Calibri" w:hAnsi="Cambria"/>
+          <w:b/>
+          <w:bCs/>
+          <w:i/>
+        </w:rPr>
+        <w:br/>
+      </w:r>
+      <w:r>
+        <w:rPr>
+          <w:rFonts w:ascii="Cambria" w:eastAsia="Calibri" w:hAnsi="Cambria"/>
+          <w:b/>
+          <w:bCs/>
+        </w:rPr>
+        <w:t xml:space="preserve">8b on the other-hand is responsible for a lot, from translating or vertical and horizontal angle, to </w:t>
+      </w:r>
+      <w:proofErr w:type="gramStart"/>
+      <w:r>
+        <w:rPr>
+          <w:rFonts w:ascii="Cambria" w:eastAsia="Calibri" w:hAnsi="Cambria"/>
+          <w:b/>
+          <w:bCs/>
+        </w:rPr>
+        <w:t>transmuting  these</w:t>
+      </w:r>
+      <w:proofErr w:type="gramEnd"/>
+      <w:r>
+        <w:rPr>
+          <w:rFonts w:ascii="Cambria" w:eastAsia="Calibri" w:hAnsi="Cambria"/>
+          <w:b/>
+          <w:bCs/>
+        </w:rPr>
+        <w:t xml:space="preserve"> angles to 3D coordinates to determine the point the camera is looking at (aka </w:t>
+      </w:r>
+      <w:proofErr w:type="spellStart"/>
+      <w:r>
+        <w:rPr>
+          <w:rFonts w:ascii="Cambria" w:eastAsia="Calibri" w:hAnsi="Cambria"/>
+          <w:b/>
+          <w:bCs/>
+        </w:rPr>
+        <w:t>camLook</w:t>
+      </w:r>
+      <w:proofErr w:type="spellEnd"/>
+      <w:r>
+        <w:rPr>
+          <w:rFonts w:ascii="Cambria" w:eastAsia="Calibri" w:hAnsi="Cambria"/>
+          <w:b/>
+          <w:bCs/>
+        </w:rPr>
+        <w:t>)</w:t>
+      </w:r>
+    </w:p>
+    <w:p>
+      <w:pPr>
+        <w:pStyle w:val="BodyText"/>
+        <w:ind w:left="360"/>
+        <w:jc w:val="both"/>
+        <w:rPr>
+          <w:rFonts w:ascii="Cambria" w:eastAsia="Calibri" w:hAnsi="Cambria"/>
+          <w:b/>
+          <w:bCs/>
+        </w:rPr>
+      </w:pPr>
+      <w:r>
+        <w:rPr>
+          <w:rFonts w:ascii="Cambria" w:eastAsia="Calibri" w:hAnsi="Cambria"/>
+          <w:b/>
+          <w:bCs/>
+          <w:noProof/>
+        </w:rPr>
+        <w:lastRenderedPageBreak/>
+        <w:drawing>
+          <wp:inline distT="0" distB="0" distL="0" distR="0" wp14:anchorId="61B01742" wp14:editId="09416F59">
+            <wp:extent cx="5876925" cy="4724400"/>
+            <wp:effectExtent l="0" t="0" r="9525" b="0"/>
+            <wp:docPr id="20" name="Picture 20"/>
+            <wp:cNvGraphicFramePr>
+              <a:graphicFrameLocks xmlns:a="http://schemas.openxmlformats.org/drawingml/2006/main" noChangeAspect="1"/>
+            </wp:cNvGraphicFramePr>
+            <a:graphic xmlns:a="http://schemas.openxmlformats.org/drawingml/2006/main">
+              <a:graphicData uri="http://schemas.openxmlformats.org/drawingml/2006/picture">
+                <pic:pic xmlns:pic="http://schemas.openxmlformats.org/drawingml/2006/picture">
+                  <pic:nvPicPr>
+                    <pic:cNvPr id="20" name="Keys.png"/>
+                    <pic:cNvPicPr/>
+                  </pic:nvPicPr>
+                  <pic:blipFill>
+                    <a:blip r:embed="rId21">
+                      <a:extLst>
+                        <a:ext uri="{28A0092B-C50C-407E-A947-70E740481C1C}">
+                          <a14:useLocalDpi xmlns:a14="http://schemas.microsoft.com/office/drawing/2010/main" val="0"/>
+                        </a:ext>
+                      </a:extLst>
+                    </a:blip>
+                    <a:stretch>
+                      <a:fillRect/>
+                    </a:stretch>
+                  </pic:blipFill>
+                  <pic:spPr>
+                    <a:xfrm>
+                      <a:off x="0" y="0"/>
+                      <a:ext cx="5876925" cy="4724400"/>
+                    </a:xfrm>
+                    <a:prstGeom prst="rect">
+                      <a:avLst/>
+                    </a:prstGeom>
+                  </pic:spPr>
+                </pic:pic>
+              </a:graphicData>
+            </a:graphic>
+          </wp:inline>
+        </w:drawing>
+      </w:r>
+    </w:p>
+    <w:p>
+      <w:pPr>
+        <w:pStyle w:val="BodyText"/>
+        <w:ind w:left="360"/>
+        <w:jc w:val="both"/>
+        <w:rPr>
+          <w:rFonts w:ascii="Cambria" w:eastAsia="Calibri" w:hAnsi="Cambria"/>
+          <w:b/>
+          <w:bCs/>
+        </w:rPr>
+      </w:pPr>
+      <w:r>
+        <w:rPr>
+          <w:rFonts w:ascii="Cambria" w:eastAsia="Calibri" w:hAnsi="Cambria"/>
+          <w:b/>
+          <w:bCs/>
+          <w:i/>
+        </w:rPr>
+        <w:t xml:space="preserve">8c: a snippet of the function </w:t>
+      </w:r>
+      <w:r>
+        <w:rPr>
+          <w:rFonts w:ascii="Cambria" w:eastAsia="Calibri" w:hAnsi="Cambria"/>
+          <w:b/>
+          <w:bCs/>
+          <w:i/>
+        </w:rPr>
+        <w:t xml:space="preserve">bound to </w:t>
+      </w:r>
+      <w:r>
+        <w:rPr>
+          <w:rFonts w:ascii="Cambria" w:eastAsia="Calibri" w:hAnsi="Cambria"/>
+          <w:b/>
+          <w:bCs/>
+          <w:i/>
+        </w:rPr>
+        <w:t>handl</w:t>
+      </w:r>
+      <w:r>
+        <w:rPr>
+          <w:rFonts w:ascii="Cambria" w:eastAsia="Calibri" w:hAnsi="Cambria"/>
+          <w:b/>
+          <w:bCs/>
+          <w:i/>
+        </w:rPr>
+        <w:t>e keyboard events detected by glut</w:t>
+      </w:r>
+      <w:r>
+        <w:rPr>
+          <w:rFonts w:ascii="Cambria" w:eastAsia="Calibri" w:hAnsi="Cambria"/>
+          <w:b/>
+          <w:bCs/>
+          <w:i/>
+        </w:rPr>
+        <w:br/>
+      </w:r>
+      <w:r>
+        <w:rPr>
+          <w:rFonts w:ascii="Cambria" w:eastAsia="Calibri" w:hAnsi="Cambria"/>
+          <w:b/>
+          <w:bCs/>
+        </w:rPr>
+        <w:t xml:space="preserve">The noteworthy thing here is that the camera comes with 2 mode one looking it to move with the camera and another that looks the camera and forces us to move on </w:t>
+      </w:r>
+      <w:r>
+        <w:rPr>
+          <w:rFonts w:ascii="Cambria" w:eastAsia="Calibri" w:hAnsi="Cambria"/>
+          <w:b/>
+          <w:bCs/>
+        </w:rPr>
+        <w:t>the invisible grid of the world, otherwise movement is as simple as using either the movement calculation based on whether were in camera mode or static mode</w:t>
+      </w:r>
+    </w:p>
+    <w:p>
+      <w:pPr>
+        <w:pStyle w:val="BodyText"/>
+        <w:ind w:left="360"/>
+        <w:jc w:val="both"/>
+        <w:rPr>
+          <w:rFonts w:ascii="Cambria" w:eastAsia="Calibri" w:hAnsi="Cambria"/>
+          <w:b/>
+          <w:bCs/>
+        </w:rPr>
+      </w:pPr>
+      <w:r>
+        <w:rPr>
+          <w:rFonts w:ascii="Cambria" w:eastAsia="Calibri" w:hAnsi="Cambria"/>
+          <w:b/>
+          <w:bCs/>
+          <w:noProof/>
+        </w:rPr>
+        <w:lastRenderedPageBreak/>
+        <w:drawing>
+          <wp:inline distT="0" distB="0" distL="0" distR="0" wp14:anchorId="1F4B6710" wp14:editId="3FE0B0C1">
+            <wp:extent cx="5114925" cy="5585460"/>
+            <wp:effectExtent l="0" t="0" r="9525" b="0"/>
+            <wp:docPr id="21" name="Picture 21"/>
+            <wp:cNvGraphicFramePr>
+              <a:graphicFrameLocks xmlns:a="http://schemas.openxmlformats.org/drawingml/2006/main" noChangeAspect="1"/>
+            </wp:cNvGraphicFramePr>
+            <a:graphic xmlns:a="http://schemas.openxmlformats.org/drawingml/2006/main">
+              <a:graphicData uri="http://schemas.openxmlformats.org/drawingml/2006/picture">
+                <pic:pic xmlns:pic="http://schemas.openxmlformats.org/drawingml/2006/picture">
+                  <pic:nvPicPr>
+                    <pic:cNvPr id="21" name="SpecialKeys.png"/>
+                    <pic:cNvPicPr/>
+                  </pic:nvPicPr>
+                  <pic:blipFill>
+                    <a:blip r:embed="rId22">
+                      <a:extLst>
+                        <a:ext uri="{28A0092B-C50C-407E-A947-70E740481C1C}">
+                          <a14:useLocalDpi xmlns:a14="http://schemas.microsoft.com/office/drawing/2010/main" val="0"/>
+                        </a:ext>
+                      </a:extLst>
+                    </a:blip>
+                    <a:stretch>
+                      <a:fillRect/>
+                    </a:stretch>
+                  </pic:blipFill>
+                  <pic:spPr>
+                    <a:xfrm>
+                      <a:off x="0" y="0"/>
+                      <a:ext cx="5114925" cy="5585460"/>
+                    </a:xfrm>
+                    <a:prstGeom prst="rect">
+                      <a:avLst/>
+                    </a:prstGeom>
+                  </pic:spPr>
+                </pic:pic>
+              </a:graphicData>
+            </a:graphic>
+          </wp:inline>
+        </w:drawing>
+      </w:r>
+    </w:p>
+    <w:p>
+      <w:pPr>
+        <w:pStyle w:val="BodyText"/>
+        <w:ind w:left="360"/>
+        <w:jc w:val="both"/>
+        <w:rPr>
+          <w:rFonts w:ascii="Cambria" w:eastAsia="Calibri" w:hAnsi="Cambria"/>
+          <w:b/>
+          <w:bCs/>
+          <w:i/>
+        </w:rPr>
+      </w:pPr>
+      <w:r>
+        <w:rPr>
+          <w:rFonts w:ascii="Cambria" w:eastAsia="Calibri" w:hAnsi="Cambria"/>
+          <w:b/>
+          <w:bCs/>
+          <w:i/>
+        </w:rPr>
+        <w:t>8d:</w:t>
+      </w:r>
+      <w:r>
+        <w:rPr>
+          <w:rFonts w:ascii="Cambria" w:eastAsia="Calibri" w:hAnsi="Cambria"/>
+          <w:b/>
+          <w:bCs/>
+          <w:i/>
+        </w:rPr>
+        <w:t xml:space="preserve"> a snippet of </w:t>
+      </w:r>
+      <w:r>
+        <w:rPr>
+          <w:rFonts w:ascii="Cambria" w:eastAsia="Calibri" w:hAnsi="Cambria"/>
+          <w:b/>
+          <w:bCs/>
+          <w:i/>
+        </w:rPr>
+        <w:t>the function bound to handle special events detected by glut</w:t>
+      </w:r>
+    </w:p>
+    <w:p>
+      <w:pPr>
+        <w:pStyle w:val="BodyText"/>
+        <w:ind w:left="360"/>
+        <w:jc w:val="both"/>
+        <w:rPr>
+          <w:rFonts w:ascii="Cambria" w:eastAsia="Calibri" w:hAnsi="Cambria"/>
+          <w:b/>
+          <w:bCs/>
+        </w:rPr>
+      </w:pPr>
+      <w:r>
+        <w:rPr>
+          <w:rFonts w:ascii="Cambria" w:eastAsia="Calibri" w:hAnsi="Cambria"/>
+          <w:b/>
+          <w:bCs/>
+        </w:rPr>
+        <w:t>This function is mostly a copy paste of the function shown in 8c, excluding the ability to switch between modes (we confess it only exists due to personal preferences where some used the WASD keys to move and others used the arrow keys)</w:t>
+      </w:r>
+    </w:p>
+    <w:p>
+      <w:pPr>
+        <w:pStyle w:val="BodyText"/>
+        <w:ind w:left="360"/>
+        <w:jc w:val="both"/>
+        <w:rPr>
+          <w:b/>
+          <w:bCs/>
+        </w:rPr>
+      </w:pPr>
+      <w:r>
+        <w:rPr>
+          <w:rFonts w:ascii="Cambria" w:eastAsia="Calibri" w:hAnsi="Cambria"/>
+          <w:b/>
+          <w:bCs/>
+          <w:noProof/>
+        </w:rPr>
+        <w:lastRenderedPageBreak/>
+        <w:drawing>
+          <wp:inline distT="0" distB="0" distL="0" distR="0" wp14:anchorId="6E50EC5B" wp14:editId="130D76F6">
+            <wp:extent cx="4770120" cy="3578492"/>
+            <wp:effectExtent l="0" t="0" r="0" b="3175"/>
+            <wp:docPr id="22" name="Picture 22"/>
+            <wp:cNvGraphicFramePr>
+              <a:graphicFrameLocks xmlns:a="http://schemas.openxmlformats.org/drawingml/2006/main" noChangeAspect="1"/>
+            </wp:cNvGraphicFramePr>
+            <a:graphic xmlns:a="http://schemas.openxmlformats.org/drawingml/2006/main">
+              <a:graphicData uri="http://schemas.openxmlformats.org/drawingml/2006/picture">
+                <pic:pic xmlns:pic="http://schemas.openxmlformats.org/drawingml/2006/picture">
+                  <pic:nvPicPr>
+                    <pic:cNvPr id="22" name="PassiveMotion.png"/>
+                    <pic:cNvPicPr/>
+                  </pic:nvPicPr>
+                  <pic:blipFill>
+                    <a:blip r:embed="rId23">
+                      <a:extLst>
+                        <a:ext uri="{28A0092B-C50C-407E-A947-70E740481C1C}">
+                          <a14:useLocalDpi xmlns:a14="http://schemas.microsoft.com/office/drawing/2010/main" val="0"/>
+                        </a:ext>
+                      </a:extLst>
+                    </a:blip>
+                    <a:stretch>
+                      <a:fillRect/>
+                    </a:stretch>
+                  </pic:blipFill>
+                  <pic:spPr>
+                    <a:xfrm>
+                      <a:off x="0" y="0"/>
+                      <a:ext cx="4782612" cy="3587864"/>
+                    </a:xfrm>
+                    <a:prstGeom prst="rect">
+                      <a:avLst/>
+                    </a:prstGeom>
+                  </pic:spPr>
+                </pic:pic>
+              </a:graphicData>
+            </a:graphic>
+          </wp:inline>
+        </w:drawing>
+      </w:r>
+    </w:p>
+    <w:p>
+      <w:pPr>
+        <w:pStyle w:val="BodyText"/>
+        <w:ind w:left="360"/>
+        <w:jc w:val="both"/>
+        <w:rPr>
+          <w:b/>
+          <w:bCs/>
+          <w:i/>
+        </w:rPr>
+      </w:pPr>
+      <w:r>
+        <w:rPr>
+          <w:b/>
+          <w:bCs/>
+          <w:i/>
+        </w:rPr>
+        <w:t>8e: this is the full function that is the heart of our interactive camera</w:t>
+      </w:r>
+    </w:p>
+    <w:p>
+      <w:pPr>
+        <w:pStyle w:val="BodyText"/>
+        <w:ind w:left="360"/>
+        <w:jc w:val="both"/>
+        <w:rPr>
+          <w:b/>
+          <w:bCs/>
+        </w:rPr>
+      </w:pPr>
+      <w:r>
+        <w:rPr>
+          <w:b/>
+          <w:bCs/>
+        </w:rPr>
+        <w:t xml:space="preserve">In 8c if we are switching into mouse mode we set some specific values this being the global </w:t>
+      </w:r>
+      <w:proofErr w:type="spellStart"/>
+      <w:r>
+        <w:rPr>
+          <w:b/>
+          <w:bCs/>
+        </w:rPr>
+        <w:t>firstMouse</w:t>
+      </w:r>
+      <w:proofErr w:type="spellEnd"/>
+      <w:r>
+        <w:rPr>
+          <w:b/>
+          <w:bCs/>
+        </w:rPr>
+        <w:t xml:space="preserve"> bool flag, as well as hid the cursor (mainly because it’s VERY distracting if left shown). </w:t>
+      </w:r>
+    </w:p>
+    <w:p>
+      <w:pPr>
+        <w:pStyle w:val="BodyText"/>
+        <w:ind w:left="360"/>
+        <w:jc w:val="both"/>
+        <w:rPr>
+          <w:b/>
+          <w:bCs/>
+        </w:rPr>
+      </w:pPr>
+      <w:r>
+        <w:rPr>
+          <w:b/>
+          <w:bCs/>
+        </w:rPr>
+        <w:t xml:space="preserve">The flag tracks if this call to the function is the first mouse to ensure we reposition </w:t>
+      </w:r>
+      <w:r>
+        <w:rPr>
+          <w:b/>
+          <w:bCs/>
+        </w:rPr>
+        <w:t>the mouse appropriately. A</w:t>
+      </w:r>
+      <w:r>
+        <w:rPr>
+          <w:b/>
+          <w:bCs/>
+        </w:rPr>
+        <w:t xml:space="preserve">fterward on the next call we can then calculate an offset based on how far the (hidden) cursor has moved from the dead center of the screen </w:t>
+      </w:r>
+      <w:r>
+        <w:rPr>
+          <w:b/>
+          <w:bCs/>
+        </w:rPr>
+        <w:t xml:space="preserve">to its new position, </w:t>
+      </w:r>
+      <w:r>
+        <w:rPr>
+          <w:b/>
+          <w:bCs/>
+        </w:rPr>
+        <w:t>this difference shall then become our angles (horizontal and vertical) whi</w:t>
+      </w:r>
+      <w:r>
+        <w:rPr>
+          <w:b/>
+          <w:bCs/>
+        </w:rPr>
+        <w:t>le ensuring we clamp the vertical values to stay in a pre-defined range (-89.9, 89.9), after this we use the function shown in 8a to update our camera or rather the point where our camera is looking at.</w:t>
+      </w:r>
+    </w:p>
+    <w:p>
+      <w:pPr>
+        <w:pStyle w:val="BodyText"/>
+        <w:ind w:left="360"/>
+        <w:jc w:val="both"/>
+        <w:rPr>
+          <w:b/>
+          <w:bCs/>
+        </w:rPr>
+      </w:pPr>
+      <w:r>
+        <w:rPr>
+          <w:b/>
+          <w:bCs/>
+        </w:rPr>
+        <w:t xml:space="preserve">Finally we reset the cursor and </w:t>
+      </w:r>
+      <w:proofErr w:type="spellStart"/>
+      <w:r>
+        <w:rPr>
+          <w:b/>
+          <w:bCs/>
+        </w:rPr>
+        <w:t>lastMouse</w:t>
+      </w:r>
+      <w:proofErr w:type="spellEnd"/>
+      <w:r>
+        <w:rPr>
+          <w:b/>
+          <w:bCs/>
+        </w:rPr>
+        <w:t xml:space="preserve"> values to the dead center of the screen to ensure the call can calculate properly before then calling </w:t>
+      </w:r>
+      <w:proofErr w:type="spellStart"/>
+      <w:proofErr w:type="gramStart"/>
+      <w:r>
+        <w:rPr>
+          <w:b/>
+          <w:bCs/>
+        </w:rPr>
+        <w:t>glutPostReDisplay</w:t>
+      </w:r>
+      <w:proofErr w:type="spellEnd"/>
+      <w:r>
+        <w:rPr>
+          <w:b/>
+          <w:bCs/>
+        </w:rPr>
+        <w:t>(</w:t>
+      </w:r>
+      <w:proofErr w:type="gramEnd"/>
+      <w:r>
+        <w:rPr>
+          <w:b/>
+          <w:bCs/>
+        </w:rPr>
+        <w:t xml:space="preserve">) which is the function used by glut to </w:t>
+      </w:r>
+      <w:proofErr w:type="spellStart"/>
+      <w:r>
+        <w:rPr>
+          <w:b/>
+          <w:bCs/>
+        </w:rPr>
+        <w:t>reDraw</w:t>
+      </w:r>
+      <w:proofErr w:type="spellEnd"/>
+      <w:r>
+        <w:rPr>
+          <w:b/>
+          <w:bCs/>
+        </w:rPr>
+        <w:t xml:space="preserve"> things to screen to “animate”</w:t>
+      </w:r>
+    </w:p>
+    <w:p>
+      <w:pPr>
+        <w:pStyle w:val="BodyText"/>
+        <w:ind w:left="360"/>
+        <w:jc w:val="both"/>
+        <w:rPr>
+          <w:b/>
+          <w:bCs/>
+        </w:rPr>
+      </w:pPr>
+    </w:p>
+    <w:p>
+      <w:pPr>
+        <w:pStyle w:val="BodyText"/>
+        <w:ind w:left="360"/>
+        <w:jc w:val="both"/>
+        <w:rPr>
+          <w:b/>
+          <w:bCs/>
+        </w:rPr>
+      </w:pPr>
+    </w:p>
+    <w:p>
+      <w:pPr>
+        <w:pStyle w:val="BodyText"/>
+        <w:ind w:left="360"/>
+        <w:jc w:val="both"/>
+        <w:rPr>
+          <w:b/>
+          <w:bCs/>
+        </w:rPr>
+      </w:pPr>
+    </w:p>
+    <w:p>
+      <w:pPr>
+        <w:pStyle w:val="BodyText"/>
+        <w:ind w:left="360"/>
+        <w:jc w:val="both"/>
+        <w:rPr>
+          <w:b/>
+          <w:bCs/>
+          <w:sz w:val="56"/>
+          <w:szCs w:val="56"/>
+        </w:rPr>
+      </w:pPr>
+      <w:r>
+        <w:rPr>
+          <w:b/>
+          <w:bCs/>
+          <w:sz w:val="56"/>
+          <w:szCs w:val="56"/>
+        </w:rPr>
+        <w:lastRenderedPageBreak/>
+        <w:t>E</w:t>
+      </w:r>
+      <w:r>
+        <w:rPr>
+          <w:b/>
+          <w:bCs/>
+          <w:sz w:val="56"/>
+          <w:szCs w:val="56"/>
+        </w:rPr>
+        <w:t>xperimentations and Results</w:t>
+      </w:r>
+    </w:p>
+    <w:p>
+      <w:pPr>
+        <w:pStyle w:val="BodyText"/>
+        <w:ind w:left="360"/>
+        <w:jc w:val="both"/>
+        <w:rPr>
+          <w:rFonts w:ascii="Cambria" w:eastAsia="Calibri" w:hAnsi="Cambria"/>
+          <w:b/>
+          <w:bCs/>
+          <w:sz w:val="36"/>
+          <w:szCs w:val="36"/>
           <w:u w:val="single"/>
         </w:rPr>
       </w:pPr>
@@ -1436,8 +3045,8 @@
           <w:rFonts w:ascii="Cambria" w:eastAsia="Calibri" w:hAnsi="Cambria"/>
           <w:b/>
           <w:bCs/>
-          <w:sz w:val="28"/>
-          <w:szCs w:val="28"/>
+          <w:sz w:val="36"/>
+          <w:szCs w:val="36"/>
           <w:u w:val="single"/>
         </w:rPr>
         <w:t>Result</w:t>
@@ -1459,6 +3068,7 @@
           <w:rFonts w:ascii="Cambria" w:eastAsia="Calibri" w:hAnsi="Cambria"/>
           <w:b/>
           <w:bCs/>
+          <w:noProof/>
         </w:rPr>
         <w:drawing>
           <wp:inline distT="0" distB="0" distL="0" distR="0" wp14:anchorId="2FB94FA7" wp14:editId="2E66E804">
@@ -1476,7 +3086,7 @@
                     <pic:cNvPicPr/>
                   </pic:nvPicPr>
                   <pic:blipFill>
-                    <a:blip r:embed="rId15"/>
+                    <a:blip r:embed="rId24"/>
                     <a:stretch>
                       <a:fillRect/>
                     </a:stretch>
@@ -1538,7 +3148,7 @@
           <w:b/>
           <w:bCs/>
         </w:rPr>
-        <w:t xml:space="preserve">The 3D solar system suspended inside a galaxy skybox, with a glowing orange-gold Sun at the center and every planet sliding around it in its own orbit. Each </w:t>
+        <w:t xml:space="preserve">The 3D solar system suspended inside a galaxy skybox, with a glowing orange-gold Sun at the center and every planet sliding around it in its own orbit. Each planet has a soft vertical gradient, so Mercury looks dusty and pale, Venus feels </w:t>
       </w:r>
       <w:r>
         <w:rPr>
@@ -1547,7 +3157,7 @@
           <w:bCs/>
         </w:rPr>
         <w:lastRenderedPageBreak/>
-        <w:t>planet has a soft vertical gradient, so Mercury looks dusty and pale, Venus feels warm and cloudy, Earth carries deep blue and green tones, Mars burns softly red, and the outer giants drift in cooler, heavier colors.</w:t>
+        <w:t>warm and cloudy, Earth carries deep blue and green tones, Mars burns softly red, and the outer giants drift in cooler, heavier colors.</w:t>
       </w:r>
     </w:p>
     <w:p>
@@ -1601,10 +3211,49 @@
           <w:bCs/>
           <w:sz w:val="28"/>
           <w:szCs w:val="28"/>
+        </w:rPr>
+      </w:pPr>
+      <w:r>
+        <w:rPr>
+          <w:rFonts w:ascii="Cambria" w:eastAsia="Calibri" w:hAnsi="Cambria"/>
+          <w:b/>
+          <w:bCs/>
+          <w:sz w:val="28"/>
+          <w:szCs w:val="28"/>
+        </w:rPr>
+        <w:t>Now let us move on to something of perhaps greater interest the journey that leads to that result shown above, well its less a journey then a series of tests so l</w:t>
+      </w:r>
+      <w:r>
+        <w:rPr>
+          <w:rFonts w:ascii="Cambria" w:eastAsia="Calibri" w:hAnsi="Cambria"/>
+          <w:b/>
+          <w:bCs/>
+          <w:sz w:val="28"/>
+          <w:szCs w:val="28"/>
+        </w:rPr>
+        <w:t>et us take you through them.</w:t>
+      </w:r>
+    </w:p>
+    <w:p>
+      <w:pPr>
+        <w:pStyle w:val="BodyText"/>
+        <w:ind w:left="360"/>
+        <w:jc w:val="both"/>
+        <w:rPr>
+          <w:rFonts w:ascii="Cambria" w:eastAsia="Calibri" w:hAnsi="Cambria"/>
+          <w:b/>
+          <w:bCs/>
+          <w:sz w:val="28"/>
+          <w:szCs w:val="28"/>
           <w:u w:val="single"/>
         </w:rPr>
       </w:pPr>
-      <w:r>
+    </w:p>
+    <w:p>
+      <w:pPr>
+        <w:pStyle w:val="BodyText"/>
+        <w:ind w:left="360"/>
+        <w:jc w:val="both"/>
         <w:rPr>
           <w:rFonts w:ascii="Cambria" w:eastAsia="Calibri" w:hAnsi="Cambria"/>
           <w:b/>
@@ -1613,6 +3262,227 @@
           <w:szCs w:val="28"/>
           <w:u w:val="single"/>
         </w:rPr>
+      </w:pPr>
+    </w:p>
+    <w:p>
+      <w:pPr>
+        <w:pStyle w:val="BodyText"/>
+        <w:ind w:left="360"/>
+        <w:jc w:val="both"/>
+        <w:rPr>
+          <w:rFonts w:ascii="Cambria" w:eastAsia="Calibri" w:hAnsi="Cambria"/>
+          <w:b/>
+          <w:bCs/>
+          <w:sz w:val="28"/>
+          <w:szCs w:val="28"/>
+          <w:u w:val="single"/>
+        </w:rPr>
+      </w:pPr>
+    </w:p>
+    <w:p>
+      <w:pPr>
+        <w:pStyle w:val="BodyText"/>
+        <w:ind w:left="360"/>
+        <w:jc w:val="both"/>
+        <w:rPr>
+          <w:rFonts w:ascii="Cambria" w:eastAsia="Calibri" w:hAnsi="Cambria"/>
+          <w:b/>
+          <w:bCs/>
+          <w:sz w:val="28"/>
+          <w:szCs w:val="28"/>
+          <w:u w:val="single"/>
+        </w:rPr>
+      </w:pPr>
+    </w:p>
+    <w:p>
+      <w:pPr>
+        <w:pStyle w:val="BodyText"/>
+        <w:ind w:left="360"/>
+        <w:jc w:val="both"/>
+        <w:rPr>
+          <w:rFonts w:ascii="Cambria" w:eastAsia="Calibri" w:hAnsi="Cambria"/>
+          <w:b/>
+          <w:bCs/>
+          <w:sz w:val="28"/>
+          <w:szCs w:val="28"/>
+          <w:u w:val="single"/>
+        </w:rPr>
+      </w:pPr>
+    </w:p>
+    <w:p>
+      <w:pPr>
+        <w:pStyle w:val="BodyText"/>
+        <w:ind w:left="360"/>
+        <w:jc w:val="both"/>
+        <w:rPr>
+          <w:rFonts w:ascii="Cambria" w:eastAsia="Calibri" w:hAnsi="Cambria"/>
+          <w:b/>
+          <w:bCs/>
+          <w:sz w:val="28"/>
+          <w:szCs w:val="28"/>
+          <w:u w:val="single"/>
+        </w:rPr>
+      </w:pPr>
+    </w:p>
+    <w:p>
+      <w:pPr>
+        <w:pStyle w:val="BodyText"/>
+        <w:ind w:left="360"/>
+        <w:jc w:val="both"/>
+        <w:rPr>
+          <w:rFonts w:ascii="Cambria" w:eastAsia="Calibri" w:hAnsi="Cambria"/>
+          <w:b/>
+          <w:bCs/>
+          <w:sz w:val="28"/>
+          <w:szCs w:val="28"/>
+          <w:u w:val="single"/>
+        </w:rPr>
+      </w:pPr>
+    </w:p>
+    <w:p>
+      <w:pPr>
+        <w:pStyle w:val="BodyText"/>
+        <w:ind w:left="360"/>
+        <w:jc w:val="both"/>
+        <w:rPr>
+          <w:rFonts w:ascii="Cambria" w:eastAsia="Calibri" w:hAnsi="Cambria"/>
+          <w:b/>
+          <w:bCs/>
+          <w:sz w:val="28"/>
+          <w:szCs w:val="28"/>
+          <w:u w:val="single"/>
+        </w:rPr>
+      </w:pPr>
+    </w:p>
+    <w:p>
+      <w:pPr>
+        <w:pStyle w:val="BodyText"/>
+        <w:ind w:left="360"/>
+        <w:jc w:val="both"/>
+        <w:rPr>
+          <w:rFonts w:ascii="Cambria" w:eastAsia="Calibri" w:hAnsi="Cambria"/>
+          <w:b/>
+          <w:bCs/>
+          <w:sz w:val="28"/>
+          <w:szCs w:val="28"/>
+          <w:u w:val="single"/>
+        </w:rPr>
+      </w:pPr>
+    </w:p>
+    <w:p>
+      <w:pPr>
+        <w:pStyle w:val="BodyText"/>
+        <w:ind w:left="360"/>
+        <w:jc w:val="both"/>
+        <w:rPr>
+          <w:rFonts w:ascii="Cambria" w:eastAsia="Calibri" w:hAnsi="Cambria"/>
+          <w:b/>
+          <w:bCs/>
+          <w:sz w:val="28"/>
+          <w:szCs w:val="28"/>
+          <w:u w:val="single"/>
+        </w:rPr>
+      </w:pPr>
+    </w:p>
+    <w:p>
+      <w:pPr>
+        <w:pStyle w:val="BodyText"/>
+        <w:ind w:left="360"/>
+        <w:jc w:val="both"/>
+        <w:rPr>
+          <w:rFonts w:ascii="Cambria" w:eastAsia="Calibri" w:hAnsi="Cambria"/>
+          <w:b/>
+          <w:bCs/>
+          <w:sz w:val="28"/>
+          <w:szCs w:val="28"/>
+          <w:u w:val="single"/>
+        </w:rPr>
+      </w:pPr>
+    </w:p>
+    <w:p>
+      <w:pPr>
+        <w:pStyle w:val="BodyText"/>
+        <w:ind w:left="360"/>
+        <w:jc w:val="both"/>
+        <w:rPr>
+          <w:rFonts w:ascii="Cambria" w:eastAsia="Calibri" w:hAnsi="Cambria"/>
+          <w:b/>
+          <w:bCs/>
+          <w:sz w:val="28"/>
+          <w:szCs w:val="28"/>
+          <w:u w:val="single"/>
+        </w:rPr>
+      </w:pPr>
+    </w:p>
+    <w:p>
+      <w:pPr>
+        <w:pStyle w:val="BodyText"/>
+        <w:ind w:left="360"/>
+        <w:jc w:val="both"/>
+        <w:rPr>
+          <w:rFonts w:ascii="Cambria" w:eastAsia="Calibri" w:hAnsi="Cambria"/>
+          <w:b/>
+          <w:bCs/>
+          <w:sz w:val="28"/>
+          <w:szCs w:val="28"/>
+          <w:u w:val="single"/>
+        </w:rPr>
+      </w:pPr>
+    </w:p>
+    <w:p>
+      <w:pPr>
+        <w:pStyle w:val="BodyText"/>
+        <w:ind w:left="360"/>
+        <w:jc w:val="both"/>
+        <w:rPr>
+          <w:rFonts w:ascii="Cambria" w:eastAsia="Calibri" w:hAnsi="Cambria"/>
+          <w:b/>
+          <w:bCs/>
+          <w:sz w:val="28"/>
+          <w:szCs w:val="28"/>
+          <w:u w:val="single"/>
+        </w:rPr>
+      </w:pPr>
+    </w:p>
+    <w:p>
+      <w:pPr>
+        <w:pStyle w:val="BodyText"/>
+        <w:ind w:left="360"/>
+        <w:jc w:val="both"/>
+        <w:rPr>
+          <w:rFonts w:ascii="Cambria" w:eastAsia="Calibri" w:hAnsi="Cambria"/>
+          <w:b/>
+          <w:bCs/>
+          <w:sz w:val="28"/>
+          <w:szCs w:val="28"/>
+          <w:u w:val="single"/>
+        </w:rPr>
+      </w:pPr>
+    </w:p>
+    <w:p>
+      <w:pPr>
+        <w:pStyle w:val="BodyText"/>
+        <w:ind w:left="360"/>
+        <w:jc w:val="both"/>
+        <w:rPr>
+          <w:rFonts w:ascii="Cambria" w:eastAsia="Calibri" w:hAnsi="Cambria"/>
+          <w:b/>
+          <w:bCs/>
+          <w:sz w:val="28"/>
+          <w:szCs w:val="28"/>
+          <w:u w:val="single"/>
+        </w:rPr>
+      </w:pPr>
+      <w:r>
+        <w:rPr>
+          <w:rFonts w:ascii="Cambria" w:eastAsia="Calibri" w:hAnsi="Cambria"/>
+          <w:b/>
+          <w:bCs/>
+          <w:sz w:val="28"/>
+          <w:szCs w:val="28"/>
+          <w:u w:val="single"/>
+        </w:rPr>
+        <w:lastRenderedPageBreak/>
         <w:t>Experiment Road:</w:t>
       </w:r>
     </w:p>
@@ -1647,7 +3517,7 @@
                     <pic:cNvPicPr/>
                   </pic:nvPicPr>
                   <pic:blipFill>
-                    <a:blip r:embed="rId16"/>
+                    <a:blip r:embed="rId25"/>
                     <a:stretch>
                       <a:fillRect/>
                     </a:stretch>
@@ -1689,7 +3559,6 @@
           <w:i/>
           <w:iCs/>
         </w:rPr>
-        <w:lastRenderedPageBreak/>
         <w:t>1b: The result of initial testing for the Planet class, showcasing a planet orbiting around the sun.</w:t>
       </w:r>
     </w:p>
@@ -1713,6 +3582,7 @@
           <w:bCs/>
           <w:i/>
           <w:iCs/>
+          <w:noProof/>
         </w:rPr>
         <w:drawing>
           <wp:inline distT="0" distB="0" distL="0" distR="0" wp14:anchorId="21DD98AE" wp14:editId="4D370581">
@@ -1730,7 +3600,7 @@
                     <pic:cNvPicPr/>
                   </pic:nvPicPr>
                   <pic:blipFill>
-                    <a:blip r:embed="rId17"/>
+                    <a:blip r:embed="rId26"/>
                     <a:stretch>
                       <a:fillRect/>
                     </a:stretch>
@@ -1772,6 +3642,7 @@
           <w:i/>
           <w:iCs/>
         </w:rPr>
+        <w:lastRenderedPageBreak/>
         <w:t>2b: The result of initial testing for Gradient Colors, showcasing the earth’s blue and green colors and the sun’s yellow and orange gradient.</w:t>
       </w:r>
     </w:p>
@@ -1795,6 +3666,7 @@
           <w:bCs/>
           <w:i/>
           <w:iCs/>
+          <w:noProof/>
         </w:rPr>
         <w:drawing>
           <wp:inline distT="0" distB="0" distL="0" distR="0" wp14:anchorId="20857661" wp14:editId="6463DB33">
@@ -1812,7 +3684,7 @@
                     <pic:cNvPicPr/>
                   </pic:nvPicPr>
                   <pic:blipFill>
-                    <a:blip r:embed="rId18"/>
+                    <a:blip r:embed="rId27"/>
                     <a:stretch>
                       <a:fillRect/>
                     </a:stretch>
@@ -1877,6 +3749,7 @@
           <w:bCs/>
           <w:i/>
           <w:iCs/>
+          <w:noProof/>
         </w:rPr>
         <w:drawing>
           <wp:inline distT="0" distB="0" distL="0" distR="0" wp14:anchorId="2D9A362B" wp14:editId="101CDA54">
@@ -1894,7 +3767,7 @@
                     <pic:cNvPicPr/>
                   </pic:nvPicPr>
                   <pic:blipFill>
-                    <a:blip r:embed="rId19"/>
+                    <a:blip r:embed="rId28"/>
                     <a:stretch>
                       <a:fillRect/>
                     </a:stretch>
@@ -1936,8 +3809,9 @@
           <w:i/>
           <w:iCs/>
         </w:rPr>
-        <w:t>4b: The result of initial testing for Moons, showcasing how the moon orbits it’s parent planet.</w:t>
-      </w:r>
+        <w:t xml:space="preserve">4b: The result of initial testing for Moons, showcasing how the moon orbits </w:t>
+      </w:r>
+      <w:proofErr w:type="gramStart"/>
       <w:r>
         <w:rPr>
           <w:rFonts w:ascii="Cambria" w:eastAsia="Calibri" w:hAnsi="Cambria"/>
@@ -1946,6 +3820,27 @@
           <w:i/>
           <w:iCs/>
         </w:rPr>
+        <w:t>it’s</w:t>
+      </w:r>
+      <w:proofErr w:type="gramEnd"/>
+      <w:r>
+        <w:rPr>
+          <w:rFonts w:ascii="Cambria" w:eastAsia="Calibri" w:hAnsi="Cambria"/>
+          <w:b/>
+          <w:bCs/>
+          <w:i/>
+          <w:iCs/>
+        </w:rPr>
+        <w:t xml:space="preserve"> parent planet.</w:t>
+      </w:r>
+      <w:r>
+        <w:rPr>
+          <w:rFonts w:ascii="Cambria" w:eastAsia="Calibri" w:hAnsi="Cambria"/>
+          <w:b/>
+          <w:bCs/>
+          <w:i/>
+          <w:iCs/>
+        </w:rPr>
         <w:t xml:space="preserve"> Keeps following the planet as it orbits the sun.</w:t>
       </w:r>
     </w:p>
@@ -1969,8 +3864,8 @@
           <w:bCs/>
           <w:i/>
           <w:iCs/>
-        </w:rPr>
-        <w:lastRenderedPageBreak/>
+          <w:noProof/>
+        </w:rPr>
         <w:drawing>
           <wp:inline distT="0" distB="0" distL="0" distR="0" wp14:anchorId="5BF8C252" wp14:editId="7143B65A">
             <wp:extent cx="1133633" cy="990738"/>
@@ -1987,7 +3882,7 @@
                     <pic:cNvPicPr/>
                   </pic:nvPicPr>
                   <pic:blipFill>
-                    <a:blip r:embed="rId20"/>
+                    <a:blip r:embed="rId29"/>
                     <a:stretch>
                       <a:fillRect/>
                     </a:stretch>
@@ -2038,6 +3933,266 @@
         <w:ind w:left="360"/>
         <w:jc w:val="both"/>
         <w:rPr>
+          <w:rFonts w:ascii="Cambria" w:eastAsia="Calibri" w:hAnsi="Cambria"/>
+          <w:b/>
+          <w:bCs/>
+          <w:i/>
+          <w:iCs/>
+        </w:rPr>
+      </w:pPr>
+      <w:r>
+        <w:rPr>
+          <w:rFonts w:ascii="Cambria" w:eastAsia="Calibri" w:hAnsi="Cambria"/>
+          <w:b/>
+          <w:bCs/>
+          <w:i/>
+          <w:iCs/>
+        </w:rPr>
+        <w:lastRenderedPageBreak/>
+        <w:drawing>
+          <wp:inline distT="0" distB="0" distL="0" distR="0" wp14:anchorId="70794596" wp14:editId="4B3168F2">
+            <wp:extent cx="5876925" cy="2880360"/>
+            <wp:effectExtent l="0" t="0" r="9525" b="0"/>
+            <wp:docPr id="25" name="Picture 25"/>
+            <wp:cNvGraphicFramePr>
+              <a:graphicFrameLocks xmlns:a="http://schemas.openxmlformats.org/drawingml/2006/main" noChangeAspect="1"/>
+            </wp:cNvGraphicFramePr>
+            <a:graphic xmlns:a="http://schemas.openxmlformats.org/drawingml/2006/main">
+              <a:graphicData uri="http://schemas.openxmlformats.org/drawingml/2006/picture">
+                <pic:pic xmlns:pic="http://schemas.openxmlformats.org/drawingml/2006/picture">
+                  <pic:nvPicPr>
+                    <pic:cNvPr id="1" name=""/>
+                    <pic:cNvPicPr/>
+                  </pic:nvPicPr>
+                  <pic:blipFill>
+                    <a:blip r:embed="rId30"/>
+                    <a:stretch>
+                      <a:fillRect/>
+                    </a:stretch>
+                  </pic:blipFill>
+                  <pic:spPr>
+                    <a:xfrm>
+                      <a:off x="0" y="0"/>
+                      <a:ext cx="5876925" cy="2880360"/>
+                    </a:xfrm>
+                    <a:prstGeom prst="rect">
+                      <a:avLst/>
+                    </a:prstGeom>
+                  </pic:spPr>
+                </pic:pic>
+              </a:graphicData>
+            </a:graphic>
+          </wp:inline>
+        </w:drawing>
+      </w:r>
+    </w:p>
+    <w:p>
+      <w:pPr>
+        <w:pStyle w:val="BodyText"/>
+        <w:ind w:left="360"/>
+        <w:jc w:val="both"/>
+        <w:rPr>
+          <w:rFonts w:ascii="Cambria" w:eastAsia="Calibri" w:hAnsi="Cambria"/>
+          <w:b/>
+          <w:bCs/>
+          <w:i/>
+          <w:iCs/>
+        </w:rPr>
+      </w:pPr>
+      <w:r>
+        <w:rPr>
+          <w:rFonts w:ascii="Cambria" w:eastAsia="Calibri" w:hAnsi="Cambria"/>
+          <w:b/>
+          <w:bCs/>
+          <w:i/>
+          <w:iCs/>
+        </w:rPr>
+        <w:t xml:space="preserve">6b: </w:t>
+      </w:r>
+      <w:r>
+        <w:rPr>
+          <w:rFonts w:ascii="Cambria" w:eastAsia="Calibri" w:hAnsi="Cambria"/>
+          <w:b/>
+          <w:bCs/>
+          <w:i/>
+          <w:iCs/>
+        </w:rPr>
+        <w:t>the result of initial testing for star and managing to get some interesting patterns to emerge. Please note dear reader that the final result uses the pattern in the top-left</w:t>
+      </w:r>
+    </w:p>
+    <w:p>
+      <w:pPr>
+        <w:pStyle w:val="BodyText"/>
+        <w:ind w:left="360"/>
+        <w:jc w:val="both"/>
+        <w:rPr>
+          <w:rFonts w:ascii="Cambria" w:eastAsia="Calibri" w:hAnsi="Cambria"/>
+          <w:b/>
+          <w:bCs/>
+          <w:i/>
+          <w:iCs/>
+        </w:rPr>
+      </w:pPr>
+      <w:bookmarkStart w:id="0" w:name="_GoBack"/>
+      <w:r>
+        <w:rPr>
+          <w:rFonts w:ascii="Cambria" w:eastAsia="Calibri" w:hAnsi="Cambria"/>
+          <w:b/>
+          <w:bCs/>
+          <w:i/>
+          <w:iCs/>
+        </w:rPr>
+        <w:drawing>
+          <wp:inline distT="0" distB="0" distL="0" distR="0" wp14:anchorId="1D7AB908" wp14:editId="33AA5CBE">
+            <wp:extent cx="5876925" cy="2819400"/>
+            <wp:effectExtent l="0" t="0" r="9525" b="0"/>
+            <wp:docPr id="26" name="Picture 26"/>
+            <wp:cNvGraphicFramePr>
+              <a:graphicFrameLocks xmlns:a="http://schemas.openxmlformats.org/drawingml/2006/main" noChangeAspect="1"/>
+            </wp:cNvGraphicFramePr>
+            <a:graphic xmlns:a="http://schemas.openxmlformats.org/drawingml/2006/main">
+              <a:graphicData uri="http://schemas.openxmlformats.org/drawingml/2006/picture">
+                <pic:pic xmlns:pic="http://schemas.openxmlformats.org/drawingml/2006/picture">
+                  <pic:nvPicPr>
+                    <pic:cNvPr id="1" name=""/>
+                    <pic:cNvPicPr/>
+                  </pic:nvPicPr>
+                  <pic:blipFill>
+                    <a:blip r:embed="rId31"/>
+                    <a:stretch>
+                      <a:fillRect/>
+                    </a:stretch>
+                  </pic:blipFill>
+                  <pic:spPr>
+                    <a:xfrm>
+                      <a:off x="0" y="0"/>
+                      <a:ext cx="5876925" cy="2819400"/>
+                    </a:xfrm>
+                    <a:prstGeom prst="rect">
+                      <a:avLst/>
+                    </a:prstGeom>
+                  </pic:spPr>
+                </pic:pic>
+              </a:graphicData>
+            </a:graphic>
+          </wp:inline>
+        </w:drawing>
+      </w:r>
+      <w:bookmarkEnd w:id="0"/>
+    </w:p>
+    <w:p>
+      <w:pPr>
+        <w:pStyle w:val="BodyText"/>
+        <w:ind w:left="360"/>
+        <w:jc w:val="both"/>
+        <w:rPr>
+          <w:rFonts w:ascii="Cambria" w:eastAsia="Calibri" w:hAnsi="Cambria"/>
+          <w:b/>
+          <w:bCs/>
+          <w:i/>
+          <w:iCs/>
+        </w:rPr>
+      </w:pPr>
+      <w:r>
+        <w:rPr>
+          <w:rFonts w:ascii="Cambria" w:eastAsia="Calibri" w:hAnsi="Cambria"/>
+          <w:b/>
+          <w:bCs/>
+          <w:i/>
+          <w:iCs/>
+        </w:rPr>
+        <w:t>7d: the result of initial testing for skybox. Apologies but we used a set of random pictures at the time when this picture was taken but it made it easier to distinguish the edges of each unlike the final result where there well hidden</w:t>
+      </w:r>
+    </w:p>
+    <w:p>
+      <w:pPr>
+        <w:pStyle w:val="BodyText"/>
+        <w:ind w:left="360"/>
+        <w:jc w:val="both"/>
+        <w:rPr>
+          <w:rFonts w:ascii="Cambria" w:eastAsia="Calibri" w:hAnsi="Cambria"/>
+          <w:b/>
+          <w:bCs/>
+          <w:i/>
+          <w:iCs/>
+        </w:rPr>
+      </w:pPr>
+      <w:r>
+        <w:rPr>
+          <w:rFonts w:ascii="Cambria" w:eastAsia="Calibri" w:hAnsi="Cambria"/>
+          <w:b/>
+          <w:bCs/>
+          <w:i/>
+          <w:iCs/>
+        </w:rPr>
+        <w:lastRenderedPageBreak/>
+        <w:drawing>
+          <wp:inline distT="0" distB="0" distL="0" distR="0" wp14:anchorId="4E00FB04" wp14:editId="16AAAD16">
+            <wp:extent cx="2800741" cy="2829320"/>
+            <wp:effectExtent l="0" t="0" r="0" b="9525"/>
+            <wp:docPr id="24" name="Picture 24"/>
+            <wp:cNvGraphicFramePr>
+              <a:graphicFrameLocks xmlns:a="http://schemas.openxmlformats.org/drawingml/2006/main" noChangeAspect="1"/>
+            </wp:cNvGraphicFramePr>
+            <a:graphic xmlns:a="http://schemas.openxmlformats.org/drawingml/2006/main">
+              <a:graphicData uri="http://schemas.openxmlformats.org/drawingml/2006/picture">
+                <pic:pic xmlns:pic="http://schemas.openxmlformats.org/drawingml/2006/picture">
+                  <pic:nvPicPr>
+                    <pic:cNvPr id="1" name=""/>
+                    <pic:cNvPicPr/>
+                  </pic:nvPicPr>
+                  <pic:blipFill>
+                    <a:blip r:embed="rId32"/>
+                    <a:stretch>
+                      <a:fillRect/>
+                    </a:stretch>
+                  </pic:blipFill>
+                  <pic:spPr>
+                    <a:xfrm>
+                      <a:off x="0" y="0"/>
+                      <a:ext cx="2800741" cy="2829320"/>
+                    </a:xfrm>
+                    <a:prstGeom prst="rect">
+                      <a:avLst/>
+                    </a:prstGeom>
+                  </pic:spPr>
+                </pic:pic>
+              </a:graphicData>
+            </a:graphic>
+          </wp:inline>
+        </w:drawing>
+      </w:r>
+    </w:p>
+    <w:p>
+      <w:pPr>
+        <w:pStyle w:val="BodyText"/>
+        <w:ind w:left="360"/>
+        <w:jc w:val="both"/>
+        <w:rPr>
+          <w:rFonts w:ascii="Cambria" w:eastAsia="Calibri" w:hAnsi="Cambria"/>
+          <w:b/>
+          <w:bCs/>
+          <w:i/>
+          <w:iCs/>
+        </w:rPr>
+      </w:pPr>
+      <w:r>
+        <w:rPr>
+          <w:rFonts w:ascii="Cambria" w:eastAsia="Calibri" w:hAnsi="Cambria"/>
+          <w:b/>
+          <w:bCs/>
+          <w:i/>
+          <w:iCs/>
+        </w:rPr>
+        <w:t>8f: The result of initial testing for the interactive camera implementation, showcasing how we can move and look around</w:t>
+      </w:r>
+    </w:p>
+    <w:p>
+      <w:pPr>
+        <w:pStyle w:val="BodyText"/>
+        <w:ind w:left="360"/>
+        <w:jc w:val="both"/>
+        <w:rPr>
           <w:rFonts w:ascii="Cambria" w:hAnsi="Cambria"/>
           <w:b/>
           <w:bCs/>
@@ -2116,9 +4271,9 @@
       </w:pPr>
     </w:p>
     <w:sectPr>
-      <w:headerReference w:type="even" r:id="rId21"/>
-      <w:headerReference w:type="default" r:id="rId22"/>
-      <w:headerReference w:type="first" r:id="rId23"/>
+      <w:headerReference w:type="even" r:id="rId33"/>
+      <w:headerReference w:type="default" r:id="rId34"/>
+      <w:headerReference w:type="first" r:id="rId35"/>
       <w:pgSz w:w="11906" w:h="16838"/>
       <w:pgMar w:top="1440" w:right="1800" w:bottom="1440" w:left="851" w:header="708" w:footer="0" w:gutter="0"/>
       <w:cols w:space="720"/>
@@ -2130,7 +4285,7 @@
 </file>
 
 <file path=word/endnotes.xml><?xml version="1.0" encoding="utf-8"?>
-<w:endnotes xmlns:wpc="http://schemas.microsoft.com/office/word/2010/wordprocessingCanvas" xmlns:cx="http://schemas.microsoft.com/office/drawing/2014/chartex" xmlns:cx1="http://schemas.microsoft.com/office/drawing/2015/9/8/chartex" xmlns:cx2="http://schemas.microsoft.com/office/drawing/2015/10/21/chartex" xmlns:cx3="http://schemas.microsoft.com/office/drawing/2016/5/9/chartex" xmlns:cx4="http://schemas.microsoft.com/office/drawing/2016/5/10/chartex" xmlns:cx5="http://schemas.microsoft.com/office/drawing/2016/5/11/chartex" xmlns:cx6="http://schemas.microsoft.com/office/drawing/2016/5/12/chartex" xmlns:cx7="http://schemas.microsoft.com/office/drawing/2016/5/13/chartex" xmlns:cx8="http://schemas.microsoft.com/office/drawing/2016/5/14/chartex" xmlns:mc="http://schemas.openxmlformats.org/markup-compatibility/2006" xmlns:aink="http://schemas.microsoft.com/office/drawing/2016/ink" xmlns:am3d="http://schemas.microsoft.com/office/drawing/2017/model3d" xmlns:o="urn:schemas-microsoft-com:office:office" xmlns:r="http://schemas.openxmlformats.org/officeDocument/2006/relationships" xmlns:m="http://schemas.openxmlformats.org/officeDocument/2006/math" xmlns:v="urn:schemas-microsoft-com:vml" xmlns:wp14="http://schemas.microsoft.com/office/word/2010/wordprocessingDrawing" xmlns:wp="http://schemas.openxmlformats.org/drawingml/2006/wordprocessingDrawing" xmlns:w10="urn:schemas-microsoft-com:office:word" xmlns:w="http://schemas.openxmlformats.org/wordprocessingml/2006/main" xmlns:w14="http://schemas.microsoft.com/office/word/2010/wordml" xmlns:w15="http://schemas.microsoft.com/office/word/2012/wordml" xmlns:w16cex="http://schemas.microsoft.com/office/word/2018/wordml/cex" xmlns:w16cid="http://schemas.microsoft.com/office/word/2016/wordml/cid" xmlns:w16="http://schemas.microsoft.com/office/word/2018/wordml" xmlns:w16sdtdh="http://schemas.microsoft.com/office/word/2020/wordml/sdtdatahash" xmlns:w16se="http://schemas.microsoft.com/office/word/2015/wordml/symex" xmlns:wpg="http://schemas.microsoft.com/office/word/2010/wordprocessingGroup" xmlns:wpi="http://schemas.microsoft.com/office/word/2010/wordprocessingInk" xmlns:wne="http://schemas.microsoft.com/office/word/2006/wordml" xmlns:wps="http://schemas.microsoft.com/office/word/2010/wordprocessingShape" mc:Ignorable="w14 w15 w16se w16cid w16 w16cex w16sdtdh wp14">
+<w:endnotes xmlns:wpc="http://schemas.microsoft.com/office/word/2010/wordprocessingCanvas" xmlns:cx="http://schemas.microsoft.com/office/drawing/2014/chartex" xmlns:mc="http://schemas.openxmlformats.org/markup-compatibility/2006" xmlns:o="urn:schemas-microsoft-com:office:office" xmlns:r="http://schemas.openxmlformats.org/officeDocument/2006/relationships" xmlns:m="http://schemas.openxmlformats.org/officeDocument/2006/math" xmlns:v="urn:schemas-microsoft-com:vml" xmlns:wp14="http://schemas.microsoft.com/office/word/2010/wordprocessingDrawing" xmlns:wp="http://schemas.openxmlformats.org/drawingml/2006/wordprocessingDrawing" xmlns:w10="urn:schemas-microsoft-com:office:word" xmlns:w="http://schemas.openxmlformats.org/wordprocessingml/2006/main" xmlns:w14="http://schemas.microsoft.com/office/word/2010/wordml" xmlns:w15="http://schemas.microsoft.com/office/word/2012/wordml" xmlns:w16se="http://schemas.microsoft.com/office/word/2015/wordml/symex" xmlns:wpg="http://schemas.microsoft.com/office/word/2010/wordprocessingGroup" xmlns:wpi="http://schemas.microsoft.com/office/word/2010/wordprocessingInk" xmlns:wne="http://schemas.microsoft.com/office/word/2006/wordml" xmlns:wps="http://schemas.microsoft.com/office/word/2010/wordprocessingShape" mc:Ignorable="w14 w15 w16se wp14">
   <w:endnote w:type="separator" w:id="-1">
     <w:p>
       <w:r>
@@ -2149,7 +4304,7 @@
 </file>
 
 <file path=word/footnotes.xml><?xml version="1.0" encoding="utf-8"?>
-<w:footnotes xmlns:wpc="http://schemas.microsoft.com/office/word/2010/wordprocessingCanvas" xmlns:cx="http://schemas.microsoft.com/office/drawing/2014/chartex" xmlns:cx1="http://schemas.microsoft.com/office/drawing/2015/9/8/chartex" xmlns:cx2="http://schemas.microsoft.com/office/drawing/2015/10/21/chartex" xmlns:cx3="http://schemas.microsoft.com/office/drawing/2016/5/9/chartex" xmlns:cx4="http://schemas.microsoft.com/office/drawing/2016/5/10/chartex" xmlns:cx5="http://schemas.microsoft.com/office/drawing/2016/5/11/chartex" xmlns:cx6="http://schemas.microsoft.com/office/drawing/2016/5/12/chartex" xmlns:cx7="http://schemas.microsoft.com/office/drawing/2016/5/13/chartex" xmlns:cx8="http://schemas.microsoft.com/office/drawing/2016/5/14/chartex" xmlns:mc="http://schemas.openxmlformats.org/markup-compatibility/2006" xmlns:aink="http://schemas.microsoft.com/office/drawing/2016/ink" xmlns:am3d="http://schemas.microsoft.com/office/drawing/2017/model3d" xmlns:o="urn:schemas-microsoft-com:office:office" xmlns:r="http://schemas.openxmlformats.org/officeDocument/2006/relationships" xmlns:m="http://schemas.openxmlformats.org/officeDocument/2006/math" xmlns:v="urn:schemas-microsoft-com:vml" xmlns:wp14="http://schemas.microsoft.com/office/word/2010/wordprocessingDrawing" xmlns:wp="http://schemas.openxmlformats.org/drawingml/2006/wordprocessingDrawing" xmlns:w10="urn:schemas-microsoft-com:office:word" xmlns:w="http://schemas.openxmlformats.org/wordprocessingml/2006/main" xmlns:w14="http://schemas.microsoft.com/office/word/2010/wordml" xmlns:w15="http://schemas.microsoft.com/office/word/2012/wordml" xmlns:w16cex="http://schemas.microsoft.com/office/word/2018/wordml/cex" xmlns:w16cid="http://schemas.microsoft.com/office/word/2016/wordml/cid" xmlns:w16="http://schemas.microsoft.com/office/word/2018/wordml" xmlns:w16sdtdh="http://schemas.microsoft.com/office/word/2020/wordml/sdtdatahash" xmlns:w16se="http://schemas.microsoft.com/office/word/2015/wordml/symex" xmlns:wpg="http://schemas.microsoft.com/office/word/2010/wordprocessingGroup" xmlns:wpi="http://schemas.microsoft.com/office/word/2010/wordprocessingInk" xmlns:wne="http://schemas.microsoft.com/office/word/2006/wordml" xmlns:wps="http://schemas.microsoft.com/office/word/2010/wordprocessingShape" mc:Ignorable="w14 w15 w16se w16cid w16 w16cex w16sdtdh wp14">
+<w:footnotes xmlns:wpc="http://schemas.microsoft.com/office/word/2010/wordprocessingCanvas" xmlns:cx="http://schemas.microsoft.com/office/drawing/2014/chartex" xmlns:mc="http://schemas.openxmlformats.org/markup-compatibility/2006" xmlns:o="urn:schemas-microsoft-com:office:office" xmlns:r="http://schemas.openxmlformats.org/officeDocument/2006/relationships" xmlns:m="http://schemas.openxmlformats.org/officeDocument/2006/math" xmlns:v="urn:schemas-microsoft-com:vml" xmlns:wp14="http://schemas.microsoft.com/office/word/2010/wordprocessingDrawing" xmlns:wp="http://schemas.openxmlformats.org/drawingml/2006/wordprocessingDrawing" xmlns:w10="urn:schemas-microsoft-com:office:word" xmlns:w="http://schemas.openxmlformats.org/wordprocessingml/2006/main" xmlns:w14="http://schemas.microsoft.com/office/word/2010/wordml" xmlns:w15="http://schemas.microsoft.com/office/word/2012/wordml" xmlns:w16se="http://schemas.microsoft.com/office/word/2015/wordml/symex" xmlns:wpg="http://schemas.microsoft.com/office/word/2010/wordprocessingGroup" xmlns:wpi="http://schemas.microsoft.com/office/word/2010/wordprocessingInk" xmlns:wne="http://schemas.microsoft.com/office/word/2006/wordml" xmlns:wps="http://schemas.microsoft.com/office/word/2010/wordprocessingShape" mc:Ignorable="w14 w15 w16se wp14">
   <w:footnote w:type="separator" w:id="-1">
     <w:p>
       <w:r>
@@ -2168,7 +4323,7 @@
 </file>
 
 <file path=word/header1.xml><?xml version="1.0" encoding="utf-8"?>
-<w:hdr xmlns:wpc="http://schemas.microsoft.com/office/word/2010/wordprocessingCanvas" xmlns:cx="http://schemas.microsoft.com/office/drawing/2014/chartex" xmlns:cx1="http://schemas.microsoft.com/office/drawing/2015/9/8/chartex" xmlns:cx2="http://schemas.microsoft.com/office/drawing/2015/10/21/chartex" xmlns:cx3="http://schemas.microsoft.com/office/drawing/2016/5/9/chartex" xmlns:cx4="http://schemas.microsoft.com/office/drawing/2016/5/10/chartex" xmlns:cx5="http://schemas.microsoft.com/office/drawing/2016/5/11/chartex" xmlns:cx6="http://schemas.microsoft.com/office/drawing/2016/5/12/chartex" xmlns:cx7="http://schemas.microsoft.com/office/drawing/2016/5/13/chartex" xmlns:cx8="http://schemas.microsoft.com/office/drawing/2016/5/14/chartex" xmlns:mc="http://schemas.openxmlformats.org/markup-compatibility/2006" xmlns:aink="http://schemas.microsoft.com/office/drawing/2016/ink" xmlns:am3d="http://schemas.microsoft.com/office/drawing/2017/model3d" xmlns:o="urn:schemas-microsoft-com:office:office" xmlns:r="http://schemas.openxmlformats.org/officeDocument/2006/relationships" xmlns:m="http://schemas.openxmlformats.org/officeDocument/2006/math" xmlns:v="urn:schemas-microsoft-com:vml" xmlns:wp14="http://schemas.microsoft.com/office/word/2010/wordprocessingDrawing" xmlns:wp="http://schemas.openxmlformats.org/drawingml/2006/wordprocessingDrawing" xmlns:w10="urn:schemas-microsoft-com:office:word" xmlns:w="http://schemas.openxmlformats.org/wordprocessingml/2006/main" xmlns:w14="http://schemas.microsoft.com/office/word/2010/wordml" xmlns:w15="http://schemas.microsoft.com/office/word/2012/wordml" xmlns:w16cex="http://schemas.microsoft.com/office/word/2018/wordml/cex" xmlns:w16cid="http://schemas.microsoft.com/office/word/2016/wordml/cid" xmlns:w16="http://schemas.microsoft.com/office/word/2018/wordml" xmlns:w16sdtdh="http://schemas.microsoft.com/office/word/2020/wordml/sdtdatahash" xmlns:w16se="http://schemas.microsoft.com/office/word/2015/wordml/symex" xmlns:wpg="http://schemas.microsoft.com/office/word/2010/wordprocessingGroup" xmlns:wpi="http://schemas.microsoft.com/office/word/2010/wordprocessingInk" xmlns:wne="http://schemas.microsoft.com/office/word/2006/wordml" xmlns:wps="http://schemas.microsoft.com/office/word/2010/wordprocessingShape" mc:Ignorable="w14 w15 w16se w16cid w16 w16cex w16sdtdh wp14">
+<w:hdr xmlns:wpc="http://schemas.microsoft.com/office/word/2010/wordprocessingCanvas" xmlns:cx="http://schemas.microsoft.com/office/drawing/2014/chartex" xmlns:mc="http://schemas.openxmlformats.org/markup-compatibility/2006" xmlns:o="urn:schemas-microsoft-com:office:office" xmlns:r="http://schemas.openxmlformats.org/officeDocument/2006/relationships" xmlns:m="http://schemas.openxmlformats.org/officeDocument/2006/math" xmlns:v="urn:schemas-microsoft-com:vml" xmlns:wp14="http://schemas.microsoft.com/office/word/2010/wordprocessingDrawing" xmlns:wp="http://schemas.openxmlformats.org/drawingml/2006/wordprocessingDrawing" xmlns:w10="urn:schemas-microsoft-com:office:word" xmlns:w="http://schemas.openxmlformats.org/wordprocessingml/2006/main" xmlns:w14="http://schemas.microsoft.com/office/word/2010/wordml" xmlns:w15="http://schemas.microsoft.com/office/word/2012/wordml" xmlns:w16se="http://schemas.microsoft.com/office/word/2015/wordml/symex" xmlns:wpg="http://schemas.microsoft.com/office/word/2010/wordprocessingGroup" xmlns:wpi="http://schemas.microsoft.com/office/word/2010/wordprocessingInk" xmlns:wne="http://schemas.microsoft.com/office/word/2006/wordml" xmlns:wps="http://schemas.microsoft.com/office/word/2010/wordprocessingShape" mc:Ignorable="w14 w15 w16se wp14">
   <w:p>
     <w:pPr>
       <w:pStyle w:val="Header"/>
@@ -2178,7 +4333,7 @@
 </file>
 
 <file path=word/header2.xml><?xml version="1.0" encoding="utf-8"?>
-<w:hdr xmlns:wpc="http://schemas.microsoft.com/office/word/2010/wordprocessingCanvas" xmlns:cx="http://schemas.microsoft.com/office/drawing/2014/chartex" xmlns:cx1="http://schemas.microsoft.com/office/drawing/2015/9/8/chartex" xmlns:cx2="http://schemas.microsoft.com/office/drawing/2015/10/21/chartex" xmlns:cx3="http://schemas.microsoft.com/office/drawing/2016/5/9/chartex" xmlns:cx4="http://schemas.microsoft.com/office/drawing/2016/5/10/chartex" xmlns:cx5="http://schemas.microsoft.com/office/drawing/2016/5/11/chartex" xmlns:cx6="http://schemas.microsoft.com/office/drawing/2016/5/12/chartex" xmlns:cx7="http://schemas.microsoft.com/office/drawing/2016/5/13/chartex" xmlns:cx8="http://schemas.microsoft.com/office/drawing/2016/5/14/chartex" xmlns:mc="http://schemas.openxmlformats.org/markup-compatibility/2006" xmlns:aink="http://schemas.microsoft.com/office/drawing/2016/ink" xmlns:am3d="http://schemas.microsoft.com/office/drawing/2017/model3d" xmlns:o="urn:schemas-microsoft-com:office:office" xmlns:r="http://schemas.openxmlformats.org/officeDocument/2006/relationships" xmlns:m="http://schemas.openxmlformats.org/officeDocument/2006/math" xmlns:v="urn:schemas-microsoft-com:vml" xmlns:wp14="http://schemas.microsoft.com/office/word/2010/wordprocessingDrawing" xmlns:wp="http://schemas.openxmlformats.org/drawingml/2006/wordprocessingDrawing" xmlns:w10="urn:schemas-microsoft-com:office:word" xmlns:w="http://schemas.openxmlformats.org/wordprocessingml/2006/main" xmlns:w14="http://schemas.microsoft.com/office/word/2010/wordml" xmlns:w15="http://schemas.microsoft.com/office/word/2012/wordml" xmlns:w16cex="http://schemas.microsoft.com/office/word/2018/wordml/cex" xmlns:w16cid="http://schemas.microsoft.com/office/word/2016/wordml/cid" xmlns:w16="http://schemas.microsoft.com/office/word/2018/wordml" xmlns:w16sdtdh="http://schemas.microsoft.com/office/word/2020/wordml/sdtdatahash" xmlns:w16se="http://schemas.microsoft.com/office/word/2015/wordml/symex" xmlns:wpg="http://schemas.microsoft.com/office/word/2010/wordprocessingGroup" xmlns:wpi="http://schemas.microsoft.com/office/word/2010/wordprocessingInk" xmlns:wne="http://schemas.microsoft.com/office/word/2006/wordml" xmlns:wps="http://schemas.microsoft.com/office/word/2010/wordprocessingShape" mc:Ignorable="w14 w15 w16se w16cid w16 w16cex w16sdtdh wp14">
+<w:hdr xmlns:wpc="http://schemas.microsoft.com/office/word/2010/wordprocessingCanvas" xmlns:cx="http://schemas.microsoft.com/office/drawing/2014/chartex" xmlns:mc="http://schemas.openxmlformats.org/markup-compatibility/2006" xmlns:o="urn:schemas-microsoft-com:office:office" xmlns:r="http://schemas.openxmlformats.org/officeDocument/2006/relationships" xmlns:m="http://schemas.openxmlformats.org/officeDocument/2006/math" xmlns:v="urn:schemas-microsoft-com:vml" xmlns:wp14="http://schemas.microsoft.com/office/word/2010/wordprocessingDrawing" xmlns:wp="http://schemas.openxmlformats.org/drawingml/2006/wordprocessingDrawing" xmlns:w10="urn:schemas-microsoft-com:office:word" xmlns:w="http://schemas.openxmlformats.org/wordprocessingml/2006/main" xmlns:w14="http://schemas.microsoft.com/office/word/2010/wordml" xmlns:w15="http://schemas.microsoft.com/office/word/2012/wordml" xmlns:w16se="http://schemas.microsoft.com/office/word/2015/wordml/symex" xmlns:wpg="http://schemas.microsoft.com/office/word/2010/wordprocessingGroup" xmlns:wpi="http://schemas.microsoft.com/office/word/2010/wordprocessingInk" xmlns:wne="http://schemas.microsoft.com/office/word/2006/wordml" xmlns:wps="http://schemas.microsoft.com/office/word/2010/wordprocessingShape" mc:Ignorable="w14 w15 w16se wp14">
   <w:p>
     <w:pPr>
       <w:pStyle w:val="Header"/>
@@ -2201,7 +4356,7 @@
         <w:noProof/>
         <w:sz w:val="20"/>
         <w:szCs w:val="20"/>
-        <w:lang w:val="en-US"/>
+        <w:lang w:val="en-US" w:bidi="ar-SA"/>
       </w:rPr>
       <w:drawing>
         <wp:inline distT="0" distB="0" distL="114300" distR="114300" wp14:anchorId="4675D4D6" wp14:editId="3172FFC4">
@@ -2252,7 +4407,7 @@
 </file>
 
 <file path=word/header3.xml><?xml version="1.0" encoding="utf-8"?>
-<w:hdr xmlns:wpc="http://schemas.microsoft.com/office/word/2010/wordprocessingCanvas" xmlns:cx="http://schemas.microsoft.com/office/drawing/2014/chartex" xmlns:cx1="http://schemas.microsoft.com/office/drawing/2015/9/8/chartex" xmlns:cx2="http://schemas.microsoft.com/office/drawing/2015/10/21/chartex" xmlns:cx3="http://schemas.microsoft.com/office/drawing/2016/5/9/chartex" xmlns:cx4="http://schemas.microsoft.com/office/drawing/2016/5/10/chartex" xmlns:cx5="http://schemas.microsoft.com/office/drawing/2016/5/11/chartex" xmlns:cx6="http://schemas.microsoft.com/office/drawing/2016/5/12/chartex" xmlns:cx7="http://schemas.microsoft.com/office/drawing/2016/5/13/chartex" xmlns:cx8="http://schemas.microsoft.com/office/drawing/2016/5/14/chartex" xmlns:mc="http://schemas.openxmlformats.org/markup-compatibility/2006" xmlns:aink="http://schemas.microsoft.com/office/drawing/2016/ink" xmlns:am3d="http://schemas.microsoft.com/office/drawing/2017/model3d" xmlns:o="urn:schemas-microsoft-com:office:office" xmlns:r="http://schemas.openxmlformats.org/officeDocument/2006/relationships" xmlns:m="http://schemas.openxmlformats.org/officeDocument/2006/math" xmlns:v="urn:schemas-microsoft-com:vml" xmlns:wp14="http://schemas.microsoft.com/office/word/2010/wordprocessingDrawing" xmlns:wp="http://schemas.openxmlformats.org/drawingml/2006/wordprocessingDrawing" xmlns:w10="urn:schemas-microsoft-com:office:word" xmlns:w="http://schemas.openxmlformats.org/wordprocessingml/2006/main" xmlns:w14="http://schemas.microsoft.com/office/word/2010/wordml" xmlns:w15="http://schemas.microsoft.com/office/word/2012/wordml" xmlns:w16cex="http://schemas.microsoft.com/office/word/2018/wordml/cex" xmlns:w16cid="http://schemas.microsoft.com/office/word/2016/wordml/cid" xmlns:w16="http://schemas.microsoft.com/office/word/2018/wordml" xmlns:w16sdtdh="http://schemas.microsoft.com/office/word/2020/wordml/sdtdatahash" xmlns:w16se="http://schemas.microsoft.com/office/word/2015/wordml/symex" xmlns:wpg="http://schemas.microsoft.com/office/word/2010/wordprocessingGroup" xmlns:wpi="http://schemas.microsoft.com/office/word/2010/wordprocessingInk" xmlns:wne="http://schemas.microsoft.com/office/word/2006/wordml" xmlns:wps="http://schemas.microsoft.com/office/word/2010/wordprocessingShape" mc:Ignorable="w14 w15 w16se w16cid w16 w16cex w16sdtdh wp14">
+<w:hdr xmlns:wpc="http://schemas.microsoft.com/office/word/2010/wordprocessingCanvas" xmlns:cx="http://schemas.microsoft.com/office/drawing/2014/chartex" xmlns:mc="http://schemas.openxmlformats.org/markup-compatibility/2006" xmlns:o="urn:schemas-microsoft-com:office:office" xmlns:r="http://schemas.openxmlformats.org/officeDocument/2006/relationships" xmlns:m="http://schemas.openxmlformats.org/officeDocument/2006/math" xmlns:v="urn:schemas-microsoft-com:vml" xmlns:wp14="http://schemas.microsoft.com/office/word/2010/wordprocessingDrawing" xmlns:wp="http://schemas.openxmlformats.org/drawingml/2006/wordprocessingDrawing" xmlns:w10="urn:schemas-microsoft-com:office:word" xmlns:w="http://schemas.openxmlformats.org/wordprocessingml/2006/main" xmlns:w14="http://schemas.microsoft.com/office/word/2010/wordml" xmlns:w15="http://schemas.microsoft.com/office/word/2012/wordml" xmlns:w16se="http://schemas.microsoft.com/office/word/2015/wordml/symex" xmlns:wpg="http://schemas.microsoft.com/office/word/2010/wordprocessingGroup" xmlns:wpi="http://schemas.microsoft.com/office/word/2010/wordprocessingInk" xmlns:wne="http://schemas.microsoft.com/office/word/2006/wordml" xmlns:wps="http://schemas.microsoft.com/office/word/2010/wordprocessingShape" mc:Ignorable="w14 w15 w16se wp14">
   <w:p>
     <w:pPr>
       <w:pStyle w:val="Header"/>
@@ -2265,6 +4420,7 @@
     <w:r>
       <w:rPr>
         <w:noProof/>
+        <w:lang w:val="en-US" w:bidi="ar-SA"/>
       </w:rPr>
       <w:drawing>
         <wp:anchor distT="0" distB="0" distL="0" distR="0" simplePos="0" relativeHeight="251659264" behindDoc="0" locked="0" layoutInCell="0" allowOverlap="1" wp14:anchorId="23CADCDE" wp14:editId="3888023F">
@@ -2377,7 +4533,7 @@
 </file>
 
 <file path=word/numbering.xml><?xml version="1.0" encoding="utf-8"?>
-<w:numbering xmlns:wpc="http://schemas.microsoft.com/office/word/2010/wordprocessingCanvas" xmlns:cx="http://schemas.microsoft.com/office/drawing/2014/chartex" xmlns:cx1="http://schemas.microsoft.com/office/drawing/2015/9/8/chartex" xmlns:cx2="http://schemas.microsoft.com/office/drawing/2015/10/21/chartex" xmlns:cx3="http://schemas.microsoft.com/office/drawing/2016/5/9/chartex" xmlns:cx4="http://schemas.microsoft.com/office/drawing/2016/5/10/chartex" xmlns:cx5="http://schemas.microsoft.com/office/drawing/2016/5/11/chartex" xmlns:cx6="http://schemas.microsoft.com/office/drawing/2016/5/12/chartex" xmlns:cx7="http://schemas.microsoft.com/office/drawing/2016/5/13/chartex" xmlns:cx8="http://schemas.microsoft.com/office/drawing/2016/5/14/chartex" xmlns:mc="http://schemas.openxmlformats.org/markup-compatibility/2006" xmlns:aink="http://schemas.microsoft.com/office/drawing/2016/ink" xmlns:am3d="http://schemas.microsoft.com/office/drawing/2017/model3d" xmlns:o="urn:schemas-microsoft-com:office:office" xmlns:r="http://schemas.openxmlformats.org/officeDocument/2006/relationships" xmlns:m="http://schemas.openxmlformats.org/officeDocument/2006/math" xmlns:v="urn:schemas-microsoft-com:vml" xmlns:wp14="http://schemas.microsoft.com/office/word/2010/wordprocessingDrawing" xmlns:wp="http://schemas.openxmlformats.org/drawingml/2006/wordprocessingDrawing" xmlns:w10="urn:schemas-microsoft-com:office:word" xmlns:w="http://schemas.openxmlformats.org/wordprocessingml/2006/main" xmlns:w14="http://schemas.microsoft.com/office/word/2010/wordml" xmlns:w15="http://schemas.microsoft.com/office/word/2012/wordml" xmlns:w16cex="http://schemas.microsoft.com/office/word/2018/wordml/cex" xmlns:w16cid="http://schemas.microsoft.com/office/word/2016/wordml/cid" xmlns:w16="http://schemas.microsoft.com/office/word/2018/wordml" xmlns:w16sdtdh="http://schemas.microsoft.com/office/word/2020/wordml/sdtdatahash" xmlns:w16se="http://schemas.microsoft.com/office/word/2015/wordml/symex" xmlns:wpg="http://schemas.microsoft.com/office/word/2010/wordprocessingGroup" xmlns:wpi="http://schemas.microsoft.com/office/word/2010/wordprocessingInk" xmlns:wne="http://schemas.microsoft.com/office/word/2006/wordml" xmlns:wps="http://schemas.microsoft.com/office/word/2010/wordprocessingShape" mc:Ignorable="w14 w15 w16se w16cid w16 w16cex w16sdtdh wp14">
+<w:numbering xmlns:wpc="http://schemas.microsoft.com/office/word/2010/wordprocessingCanvas" xmlns:cx="http://schemas.microsoft.com/office/drawing/2014/chartex" xmlns:mc="http://schemas.openxmlformats.org/markup-compatibility/2006" xmlns:o="urn:schemas-microsoft-com:office:office" xmlns:r="http://schemas.openxmlformats.org/officeDocument/2006/relationships" xmlns:m="http://schemas.openxmlformats.org/officeDocument/2006/math" xmlns:v="urn:schemas-microsoft-com:vml" xmlns:wp14="http://schemas.microsoft.com/office/word/2010/wordprocessingDrawing" xmlns:wp="http://schemas.openxmlformats.org/drawingml/2006/wordprocessingDrawing" xmlns:w10="urn:schemas-microsoft-com:office:word" xmlns:w="http://schemas.openxmlformats.org/wordprocessingml/2006/main" xmlns:w14="http://schemas.microsoft.com/office/word/2010/wordml" xmlns:w15="http://schemas.microsoft.com/office/word/2012/wordml" xmlns:w16se="http://schemas.microsoft.com/office/word/2015/wordml/symex" xmlns:wpg="http://schemas.microsoft.com/office/word/2010/wordprocessingGroup" xmlns:wpi="http://schemas.microsoft.com/office/word/2010/wordprocessingInk" xmlns:wne="http://schemas.microsoft.com/office/word/2006/wordml" xmlns:wps="http://schemas.microsoft.com/office/word/2010/wordprocessingShape" mc:Ignorable="w14 w15 w16se wp14">
   <w:abstractNum w:abstractNumId="0" w15:restartNumberingAfterBreak="0">
     <w:nsid w:val="0053208E"/>
     <w:multiLevelType w:val="multilevel"/>
@@ -2498,7 +4654,7 @@
 </file>
 
 <file path=word/styles.xml><?xml version="1.0" encoding="utf-8"?>
-<w:styles xmlns:mc="http://schemas.openxmlformats.org/markup-compatibility/2006" xmlns:r="http://schemas.openxmlformats.org/officeDocument/2006/relationships" xmlns:w="http://schemas.openxmlformats.org/wordprocessingml/2006/main" xmlns:w14="http://schemas.microsoft.com/office/word/2010/wordml" xmlns:w15="http://schemas.microsoft.com/office/word/2012/wordml" xmlns:w16cex="http://schemas.microsoft.com/office/word/2018/wordml/cex" xmlns:w16cid="http://schemas.microsoft.com/office/word/2016/wordml/cid" xmlns:w16="http://schemas.microsoft.com/office/word/2018/wordml" xmlns:w16sdtdh="http://schemas.microsoft.com/office/word/2020/wordml/sdtdatahash" xmlns:w16se="http://schemas.microsoft.com/office/word/2015/wordml/symex" mc:Ignorable="w14 w15 w16se w16cid w16 w16cex w16sdtdh">
+<w:styles xmlns:mc="http://schemas.openxmlformats.org/markup-compatibility/2006" xmlns:r="http://schemas.openxmlformats.org/officeDocument/2006/relationships" xmlns:w="http://schemas.openxmlformats.org/wordprocessingml/2006/main" xmlns:w14="http://schemas.microsoft.com/office/word/2010/wordml" xmlns:w15="http://schemas.microsoft.com/office/word/2012/wordml" xmlns:w16se="http://schemas.microsoft.com/office/word/2015/wordml/symex" mc:Ignorable="w14 w15 w16se">
   <w:docDefaults>
     <w:rPrDefault>
       <w:rPr>
@@ -2508,7 +4664,7 @@
     </w:rPrDefault>
     <w:pPrDefault/>
   </w:docDefaults>
-  <w:latentStyles w:defLockedState="0" w:defUIPriority="99" w:defSemiHidden="0" w:defUnhideWhenUsed="0" w:defQFormat="0" w:count="376">
+  <w:latentStyles w:defLockedState="0" w:defUIPriority="99" w:defSemiHidden="0" w:defUnhideWhenUsed="0" w:defQFormat="0" w:count="371">
     <w:lsdException w:name="Normal" w:uiPriority="0" w:qFormat="1"/>
     <w:lsdException w:name="heading 1" w:uiPriority="9" w:qFormat="1"/>
     <w:lsdException w:name="heading 2" w:uiPriority="9" w:unhideWhenUsed="1" w:qFormat="1"/>
@@ -2878,11 +5034,6 @@
     <w:lsdException w:name="List Table 5 Dark Accent 6" w:uiPriority="50"/>
     <w:lsdException w:name="List Table 6 Colorful Accent 6" w:uiPriority="51"/>
     <w:lsdException w:name="List Table 7 Colorful Accent 6" w:uiPriority="52"/>
-    <w:lsdException w:name="Mention" w:semiHidden="1" w:unhideWhenUsed="1"/>
-    <w:lsdException w:name="Smart Hyperlink" w:semiHidden="1" w:unhideWhenUsed="1"/>
-    <w:lsdException w:name="Hashtag" w:semiHidden="1" w:unhideWhenUsed="1"/>
-    <w:lsdException w:name="Unresolved Mention" w:semiHidden="1" w:unhideWhenUsed="1"/>
-    <w:lsdException w:name="Smart Link" w:semiHidden="1" w:unhideWhenUsed="1"/>
   </w:latentStyles>
   <w:style w:type="paragraph" w:default="1" w:styleId="Normal">
     <w:name w:val="Normal"/>
@@ -2979,6 +5130,7 @@
   <w:style w:type="paragraph" w:styleId="BodyText">
     <w:name w:val="Body Text"/>
     <w:basedOn w:val="Normal"/>
+    <w:link w:val="BodyTextChar"/>
     <w:pPr>
       <w:spacing w:after="140" w:line="276" w:lineRule="auto"/>
     </w:pPr>
@@ -3256,6 +5408,17 @@
       <w:ind w:left="567" w:right="567"/>
     </w:pPr>
   </w:style>
+  <w:style w:type="character" w:customStyle="1" w:styleId="BodyTextChar">
+    <w:name w:val="Body Text Char"/>
+    <w:basedOn w:val="DefaultParagraphFont"/>
+    <w:link w:val="BodyText"/>
+    <w:rsid w:val="00AE0BE1"/>
+    <w:rPr>
+      <w:rFonts w:ascii="Times New Roman" w:hAnsi="Times New Roman" w:cs="Times New Roman"/>
+      <w:sz w:val="24"/>
+      <w:szCs w:val="24"/>
+    </w:rPr>
+  </w:style>
 </w:styles>
 </file>
 
@@ -3434,14 +5597,6 @@
 </file>
 
 <file path=customXml/item1.xml><?xml version="1.0" encoding="utf-8"?>
-<p:properties xmlns:p="http://schemas.microsoft.com/office/2006/metadata/properties" xmlns:xsi="http://www.w3.org/2001/XMLSchema-instance" xmlns:pc="http://schemas.microsoft.com/office/infopath/2007/PartnerControls">
-  <documentManagement>
-    <ReferenceId xmlns="f7116e6e-3d81-458b-a352-7969875bbae6" xsi:nil="true"/>
-  </documentManagement>
-</p:properties>
-</file>
-
-<file path=customXml/item2.xml><?xml version="1.0" encoding="utf-8"?>
 <ct:contentTypeSchema xmlns:ct="http://schemas.microsoft.com/office/2006/metadata/contentType" xmlns:ma="http://schemas.microsoft.com/office/2006/metadata/properties/metaAttributes" ct:_="" ma:_="" ma:contentTypeName="Document" ma:contentTypeID="0x0101000C8AE8726FD7014E92BC969563E1A6F1" ma:contentTypeVersion="1" ma:contentTypeDescription="Create a new document." ma:contentTypeScope="" ma:versionID="3c5e26aa32a145d09767392b5fde6f7c">
   <xsd:schema xmlns:xsd="http://www.w3.org/2001/XMLSchema" xmlns:xs="http://www.w3.org/2001/XMLSchema" xmlns:p="http://schemas.microsoft.com/office/2006/metadata/properties" xmlns:ns2="f7116e6e-3d81-458b-a352-7969875bbae6" targetNamespace="http://schemas.microsoft.com/office/2006/metadata/properties" ma:root="true" ma:fieldsID="4f1507d7c91411ce06e9d9b613e81472" ns2:_="">
     <xsd:import namespace="f7116e6e-3d81-458b-a352-7969875bbae6"/>
@@ -3567,6 +5722,14 @@
 </ct:contentTypeSchema>
 </file>
 
+<file path=customXml/item2.xml><?xml version="1.0" encoding="utf-8"?>
+<p:properties xmlns:p="http://schemas.microsoft.com/office/2006/metadata/properties" xmlns:xsi="http://www.w3.org/2001/XMLSchema-instance" xmlns:pc="http://schemas.microsoft.com/office/infopath/2007/PartnerControls">
+  <documentManagement>
+    <ReferenceId xmlns="f7116e6e-3d81-458b-a352-7969875bbae6" xsi:nil="true"/>
+  </documentManagement>
+</p:properties>
+</file>
+
 <file path=customXml/item3.xml><?xml version="1.0" encoding="utf-8"?>
 <?mso-contentType ?>
 <FormTemplates xmlns="http://schemas.microsoft.com/sharepoint/v3/contenttype/forms">
@@ -3577,16 +5740,6 @@
 </file>
 
 <file path=customXml/itemProps1.xml><?xml version="1.0" encoding="utf-8"?>
-<ds:datastoreItem xmlns:ds="http://schemas.openxmlformats.org/officeDocument/2006/customXml" ds:itemID="{0B300725-1B7A-4BFB-93B2-5575EAB34BC5}">
-  <ds:schemaRefs>
-    <ds:schemaRef ds:uri="http://schemas.microsoft.com/office/2006/metadata/properties"/>
-    <ds:schemaRef ds:uri="http://schemas.microsoft.com/office/infopath/2007/PartnerControls"/>
-    <ds:schemaRef ds:uri="f7116e6e-3d81-458b-a352-7969875bbae6"/>
-  </ds:schemaRefs>
-</ds:datastoreItem>
-</file>
-
-<file path=customXml/itemProps2.xml><?xml version="1.0" encoding="utf-8"?>
 <ds:datastoreItem xmlns:ds="http://schemas.openxmlformats.org/officeDocument/2006/customXml" ds:itemID="{4CB6A411-CAB6-4CCD-9331-5780FA5A7A71}">
   <ds:schemaRefs>
     <ds:schemaRef ds:uri="http://schemas.microsoft.com/office/2006/metadata/contentType"/>
@@ -3604,6 +5757,16 @@
 </ds:datastoreItem>
 </file>
 
+<file path=customXml/itemProps2.xml><?xml version="1.0" encoding="utf-8"?>
+<ds:datastoreItem xmlns:ds="http://schemas.openxmlformats.org/officeDocument/2006/customXml" ds:itemID="{0B300725-1B7A-4BFB-93B2-5575EAB34BC5}">
+  <ds:schemaRefs>
+    <ds:schemaRef ds:uri="http://schemas.microsoft.com/office/2006/metadata/properties"/>
+    <ds:schemaRef ds:uri="http://schemas.microsoft.com/office/infopath/2007/PartnerControls"/>
+    <ds:schemaRef ds:uri="f7116e6e-3d81-458b-a352-7969875bbae6"/>
+  </ds:schemaRefs>
+</ds:datastoreItem>
+</file>
+
 <file path=customXml/itemProps3.xml><?xml version="1.0" encoding="utf-8"?>
 <ds:datastoreItem xmlns:ds="http://schemas.openxmlformats.org/officeDocument/2006/customXml" ds:itemID="{6BC7A6CC-81A0-4836-94F8-3255B4AE2DFA}">
   <ds:schemaRefs>

</xml_diff>